<commit_message>
Ya agrege el reporte de tokens y de errores, al igual que la grafica de barras aparentemente al 100 al igual que la grafica de lineas, ademas de los 2 reportes, agregue una clase token para el reporte de tokens y tambien una lista para guardar los tokens la cual es usada en el lenguaje lexico del fca y del js
</commit_message>
<xml_diff>
--- a/ManualTecnico.docx
+++ b/ManualTecnico.docx
@@ -20,8 +20,19 @@
           <w:szCs w:val="24"/>
           <w:lang w:val="es-GT"/>
         </w:rPr>
-        <w:t>Nombre: Luis Antonio Cutzal Chali</w:t>
-      </w:r>
+        <w:t xml:space="preserve">Nombre: Luis Antonio Cutzal </w:t>
+      </w:r>
+      <w:proofErr w:type="spellStart"/>
+      <w:r>
+        <w:rPr>
+          <w:rFonts w:ascii="Arial" w:hAnsi="Arial" w:cs="Arial"/>
+          <w:sz w:val="24"/>
+          <w:szCs w:val="24"/>
+          <w:lang w:val="es-GT"/>
+        </w:rPr>
+        <w:t>Chali</w:t>
+      </w:r>
+      <w:proofErr w:type="spellEnd"/>
       <w:r>
         <w:rPr>
           <w:rFonts w:ascii="Arial" w:hAnsi="Arial" w:cs="Arial"/>
@@ -539,8 +550,18 @@
           <w:sz w:val="24"/>
           <w:szCs w:val="24"/>
         </w:rPr>
-        <w:t>Kevin Lajpop</w:t>
-      </w:r>
+        <w:t xml:space="preserve">Kevin </w:t>
+      </w:r>
+      <w:proofErr w:type="spellStart"/>
+      <w:r>
+        <w:rPr>
+          <w:rFonts w:ascii="Arial" w:hAnsi="Arial" w:cs="Arial"/>
+          <w:sz w:val="24"/>
+          <w:szCs w:val="24"/>
+        </w:rPr>
+        <w:t>Lajpop</w:t>
+      </w:r>
+      <w:proofErr w:type="spellEnd"/>
       <w:r>
         <w:rPr>
           <w:rFonts w:ascii="Arial" w:hAnsi="Arial" w:cs="Arial"/>
@@ -643,7 +664,25 @@
           <w:sz w:val="24"/>
           <w:szCs w:val="24"/>
         </w:rPr>
-        <w:t>De acuerdo con el enunciado del Proyecto 1, se creo una herramienta el cual servirá de apoyo a los tutores académicos en el análisis del código fuente de los diferentes proyectos desarrollados por los estudiantes con el fin de agilizar los procesos de búsqueda de copias.</w:t>
+        <w:t xml:space="preserve">De acuerdo con el enunciado del Proyecto 1, se </w:t>
+      </w:r>
+      <w:proofErr w:type="spellStart"/>
+      <w:r>
+        <w:rPr>
+          <w:rFonts w:ascii="Arial" w:hAnsi="Arial" w:cs="Arial"/>
+          <w:sz w:val="24"/>
+          <w:szCs w:val="24"/>
+        </w:rPr>
+        <w:t>creo</w:t>
+      </w:r>
+      <w:proofErr w:type="spellEnd"/>
+      <w:r>
+        <w:rPr>
+          <w:rFonts w:ascii="Arial" w:hAnsi="Arial" w:cs="Arial"/>
+          <w:sz w:val="24"/>
+          <w:szCs w:val="24"/>
+        </w:rPr>
+        <w:t xml:space="preserve"> una herramienta el cual servirá de apoyo a los tutores académicos en el análisis del código fuente de los diferentes proyectos desarrollados por los estudiantes con el fin de agilizar los procesos de búsqueda de copias.</w:t>
       </w:r>
     </w:p>
     <w:p>
@@ -720,6 +759,7 @@
           <w:szCs w:val="24"/>
         </w:rPr>
       </w:pPr>
+      <w:bookmarkStart w:id="0" w:name="_Hlk81745875"/>
       <w:r>
         <w:rPr>
           <w:rFonts w:ascii="Arial" w:hAnsi="Arial" w:cs="Arial"/>
@@ -738,7 +778,29 @@
           <w:sz w:val="24"/>
           <w:szCs w:val="24"/>
         </w:rPr>
-        <w:t xml:space="preserve"> 8.2 o Apache NetBeans 12.4, esto para poder ejecutar la herramienta, en caso de no tener alguno de los 2 IDE´s deberá descargarlo desde la página oficial.</w:t>
+        <w:t xml:space="preserve"> 8.2 o Apache NetBeans 12.4, esto para poder ejecutar la herramienta, en caso de no tener alguno de los 2 </w:t>
+      </w:r>
+      <w:proofErr w:type="spellStart"/>
+      <w:r>
+        <w:rPr>
+          <w:rFonts w:ascii="Arial" w:hAnsi="Arial" w:cs="Arial"/>
+          <w:b/>
+          <w:bCs/>
+          <w:sz w:val="24"/>
+          <w:szCs w:val="24"/>
+        </w:rPr>
+        <w:t>IDE´s</w:t>
+      </w:r>
+      <w:proofErr w:type="spellEnd"/>
+      <w:r>
+        <w:rPr>
+          <w:rFonts w:ascii="Arial" w:hAnsi="Arial" w:cs="Arial"/>
+          <w:b/>
+          <w:bCs/>
+          <w:sz w:val="24"/>
+          <w:szCs w:val="24"/>
+        </w:rPr>
+        <w:t xml:space="preserve"> deberá descargarlo desde la página oficial.</w:t>
       </w:r>
     </w:p>
     <w:p>
@@ -949,7 +1011,27 @@
           <w:sz w:val="24"/>
           <w:szCs w:val="24"/>
         </w:rPr>
-        <w:t>, haberlos cargados a la aplicación, dichos archivos sirven para generar las graficas de Barras, Pie y Lineales de los reportes.</w:t>
+        <w:t xml:space="preserve">, haberlos cargados a la aplicación, dichos archivos sirven para generar las </w:t>
+      </w:r>
+      <w:r>
+        <w:rPr>
+          <w:rFonts w:ascii="Arial" w:hAnsi="Arial" w:cs="Arial"/>
+          <w:b/>
+          <w:bCs/>
+          <w:sz w:val="24"/>
+          <w:szCs w:val="24"/>
+        </w:rPr>
+        <w:t>gráficas</w:t>
+      </w:r>
+      <w:r>
+        <w:rPr>
+          <w:rFonts w:ascii="Arial" w:hAnsi="Arial" w:cs="Arial"/>
+          <w:b/>
+          <w:bCs/>
+          <w:sz w:val="24"/>
+          <w:szCs w:val="24"/>
+        </w:rPr>
+        <w:t xml:space="preserve"> de Barras, Pie y Lineales de los reportes.</w:t>
       </w:r>
     </w:p>
     <w:p>
@@ -1006,6 +1088,7 @@
         <w:t>Tener como mínimo 4 GB de memoria RAM en su computador.</w:t>
       </w:r>
     </w:p>
+    <w:bookmarkEnd w:id="0"/>
     <w:p>
       <w:pPr>
         <w:jc w:val="both"/>
@@ -1086,7 +1169,25 @@
           <w:sz w:val="24"/>
           <w:szCs w:val="24"/>
         </w:rPr>
-        <w:t>l main el cual ejecuta la ventana de la aplicación.</w:t>
+        <w:t xml:space="preserve">l </w:t>
+      </w:r>
+      <w:proofErr w:type="spellStart"/>
+      <w:r>
+        <w:rPr>
+          <w:rFonts w:ascii="Arial" w:hAnsi="Arial" w:cs="Arial"/>
+          <w:sz w:val="24"/>
+          <w:szCs w:val="24"/>
+        </w:rPr>
+        <w:t>main</w:t>
+      </w:r>
+      <w:proofErr w:type="spellEnd"/>
+      <w:r>
+        <w:rPr>
+          <w:rFonts w:ascii="Arial" w:hAnsi="Arial" w:cs="Arial"/>
+          <w:sz w:val="24"/>
+          <w:szCs w:val="24"/>
+        </w:rPr>
+        <w:t xml:space="preserve"> el cual ejecuta la ventana de la aplicación.</w:t>
       </w:r>
     </w:p>
     <w:p>
@@ -1528,6 +1629,7 @@
         </w:rPr>
         <w:t xml:space="preserve">Clase utilizada en el archivo </w:t>
       </w:r>
+      <w:proofErr w:type="spellStart"/>
       <w:r>
         <w:rPr>
           <w:rFonts w:ascii="Arial" w:hAnsi="Arial" w:cs="Arial"/>
@@ -1538,6 +1640,7 @@
         </w:rPr>
         <w:t>Analizador_Sintactico.cup</w:t>
       </w:r>
+      <w:proofErr w:type="spellEnd"/>
       <w:r>
         <w:rPr>
           <w:rFonts w:ascii="Arial" w:hAnsi="Arial" w:cs="Arial"/>
@@ -1624,6 +1727,7 @@
         </w:rPr>
         <w:t xml:space="preserve"> </w:t>
       </w:r>
+      <w:proofErr w:type="spellStart"/>
       <w:r>
         <w:rPr>
           <w:rFonts w:ascii="Arial" w:hAnsi="Arial" w:cs="Arial"/>
@@ -1634,6 +1738,7 @@
         </w:rPr>
         <w:t>ASintactico.cup</w:t>
       </w:r>
+      <w:proofErr w:type="spellEnd"/>
       <w:r>
         <w:rPr>
           <w:rFonts w:ascii="Arial" w:hAnsi="Arial" w:cs="Arial"/>
@@ -1714,6 +1819,7 @@
         </w:rPr>
         <w:t xml:space="preserve"> </w:t>
       </w:r>
+      <w:proofErr w:type="spellStart"/>
       <w:r>
         <w:rPr>
           <w:rFonts w:ascii="Arial" w:hAnsi="Arial" w:cs="Arial"/>
@@ -1724,6 +1830,7 @@
         </w:rPr>
         <w:t>ALexico.jflex</w:t>
       </w:r>
+      <w:proofErr w:type="spellEnd"/>
       <w:r>
         <w:rPr>
           <w:rFonts w:ascii="Arial" w:hAnsi="Arial" w:cs="Arial"/>
@@ -1794,6 +1901,7 @@
         </w:rPr>
         <w:t xml:space="preserve"> </w:t>
       </w:r>
+      <w:proofErr w:type="spellStart"/>
       <w:r>
         <w:rPr>
           <w:rFonts w:ascii="Arial" w:hAnsi="Arial" w:cs="Arial"/>
@@ -1804,6 +1912,7 @@
         </w:rPr>
         <w:t>Analizador_Sintactico.cup</w:t>
       </w:r>
+      <w:proofErr w:type="spellEnd"/>
       <w:r>
         <w:rPr>
           <w:rFonts w:ascii="Arial" w:hAnsi="Arial" w:cs="Arial"/>
@@ -1862,6 +1971,7 @@
         </w:rPr>
         <w:t xml:space="preserve">Generador de la clase </w:t>
       </w:r>
+      <w:proofErr w:type="spellStart"/>
       <w:r>
         <w:rPr>
           <w:rFonts w:ascii="Arial" w:hAnsi="Arial" w:cs="Arial"/>
@@ -1872,6 +1982,7 @@
         </w:rPr>
         <w:t>Analizador_Lexico.jflex</w:t>
       </w:r>
+      <w:proofErr w:type="spellEnd"/>
       <w:r>
         <w:rPr>
           <w:rFonts w:ascii="Arial" w:hAnsi="Arial" w:cs="Arial"/>
@@ -1930,6 +2041,7 @@
         </w:rPr>
         <w:t xml:space="preserve">Clase que contiene todas las producciones en lenguaje java de los archivos </w:t>
       </w:r>
+      <w:proofErr w:type="spellStart"/>
       <w:r>
         <w:rPr>
           <w:rFonts w:ascii="Arial" w:hAnsi="Arial" w:cs="Arial"/>
@@ -1940,6 +2052,7 @@
         </w:rPr>
         <w:t>ASintactico.cup</w:t>
       </w:r>
+      <w:proofErr w:type="spellEnd"/>
       <w:r>
         <w:rPr>
           <w:rFonts w:ascii="Arial" w:hAnsi="Arial" w:cs="Arial"/>
@@ -1950,6 +2063,7 @@
         </w:rPr>
         <w:t xml:space="preserve"> y </w:t>
       </w:r>
+      <w:proofErr w:type="spellStart"/>
       <w:r>
         <w:rPr>
           <w:rFonts w:ascii="Arial" w:hAnsi="Arial" w:cs="Arial"/>
@@ -1960,6 +2074,7 @@
         </w:rPr>
         <w:t>Analizador_Sintactico.cup</w:t>
       </w:r>
+      <w:proofErr w:type="spellEnd"/>
       <w:r>
         <w:rPr>
           <w:rFonts w:ascii="Arial" w:hAnsi="Arial" w:cs="Arial"/>
@@ -2062,6 +2177,7 @@
           <w:szCs w:val="24"/>
         </w:rPr>
       </w:pPr>
+      <w:proofErr w:type="spellStart"/>
       <w:r>
         <w:rPr>
           <w:rFonts w:ascii="Arial" w:hAnsi="Arial" w:cs="Arial"/>
@@ -2072,6 +2188,7 @@
         </w:rPr>
         <w:t>ASintactico.cup</w:t>
       </w:r>
+      <w:proofErr w:type="spellEnd"/>
       <w:r>
         <w:rPr>
           <w:rFonts w:ascii="Arial" w:hAnsi="Arial" w:cs="Arial"/>
@@ -2100,6 +2217,7 @@
           <w:szCs w:val="24"/>
         </w:rPr>
       </w:pPr>
+      <w:proofErr w:type="spellStart"/>
       <w:r>
         <w:rPr>
           <w:rFonts w:ascii="Arial" w:hAnsi="Arial" w:cs="Arial"/>
@@ -2110,6 +2228,7 @@
         </w:rPr>
         <w:t>ALexico.jflex</w:t>
       </w:r>
+      <w:proofErr w:type="spellEnd"/>
       <w:r>
         <w:rPr>
           <w:rFonts w:ascii="Arial" w:hAnsi="Arial" w:cs="Arial"/>
@@ -2224,6 +2343,7 @@
           <w:szCs w:val="24"/>
         </w:rPr>
       </w:pPr>
+      <w:proofErr w:type="spellStart"/>
       <w:r>
         <w:rPr>
           <w:rFonts w:ascii="Arial" w:hAnsi="Arial" w:cs="Arial"/>
@@ -2234,6 +2354,7 @@
         </w:rPr>
         <w:t>Analizador_Sintactico.cup</w:t>
       </w:r>
+      <w:proofErr w:type="spellEnd"/>
       <w:r>
         <w:rPr>
           <w:rFonts w:ascii="Arial" w:hAnsi="Arial" w:cs="Arial"/>
@@ -2270,6 +2391,7 @@
           <w:szCs w:val="24"/>
         </w:rPr>
       </w:pPr>
+      <w:proofErr w:type="spellStart"/>
       <w:r>
         <w:rPr>
           <w:rFonts w:ascii="Arial" w:hAnsi="Arial" w:cs="Arial"/>
@@ -2280,6 +2402,7 @@
         </w:rPr>
         <w:t>Analizador_Lexico.jflex</w:t>
       </w:r>
+      <w:proofErr w:type="spellEnd"/>
       <w:r>
         <w:rPr>
           <w:rFonts w:ascii="Arial" w:hAnsi="Arial" w:cs="Arial"/>
@@ -2551,7 +2674,25 @@
           <w:sz w:val="24"/>
           <w:szCs w:val="24"/>
         </w:rPr>
-        <w:t>Generará un archivo el cual contendrá un resumen de las graficas y tablas que genera la aplicación.</w:t>
+        <w:t xml:space="preserve">Generará un archivo el cual contendrá un resumen de las </w:t>
+      </w:r>
+      <w:proofErr w:type="spellStart"/>
+      <w:r>
+        <w:rPr>
+          <w:rFonts w:ascii="Arial" w:hAnsi="Arial" w:cs="Arial"/>
+          <w:sz w:val="24"/>
+          <w:szCs w:val="24"/>
+        </w:rPr>
+        <w:t>graficas</w:t>
+      </w:r>
+      <w:proofErr w:type="spellEnd"/>
+      <w:r>
+        <w:rPr>
+          <w:rFonts w:ascii="Arial" w:hAnsi="Arial" w:cs="Arial"/>
+          <w:sz w:val="24"/>
+          <w:szCs w:val="24"/>
+        </w:rPr>
+        <w:t xml:space="preserve"> y tablas que genera la aplicación.</w:t>
       </w:r>
     </w:p>
     <w:p>
@@ -2617,7 +2758,25 @@
           <w:sz w:val="24"/>
           <w:szCs w:val="24"/>
         </w:rPr>
-        <w:t>Método que recibe un Nodo y una lista de tipo string de variables, el cual sirve para manipular de una forma más fácil los datos de la gramática de JavaScript, introducir dichos datos en otras litas para luego utilizarlas en los métodos de comparación de clases</w:t>
+        <w:t xml:space="preserve">Método que recibe un Nodo y una lista de tipo </w:t>
+      </w:r>
+      <w:proofErr w:type="spellStart"/>
+      <w:r>
+        <w:rPr>
+          <w:rFonts w:ascii="Arial" w:hAnsi="Arial" w:cs="Arial"/>
+          <w:sz w:val="24"/>
+          <w:szCs w:val="24"/>
+        </w:rPr>
+        <w:t>string</w:t>
+      </w:r>
+      <w:proofErr w:type="spellEnd"/>
+      <w:r>
+        <w:rPr>
+          <w:rFonts w:ascii="Arial" w:hAnsi="Arial" w:cs="Arial"/>
+          <w:sz w:val="24"/>
+          <w:szCs w:val="24"/>
+        </w:rPr>
+        <w:t xml:space="preserve"> de variables, el cual sirve para manipular de una forma más fácil los datos de la gramática de JavaScript, introducir dichos datos en otras litas para luego utilizarlas en los métodos de comparación de clases</w:t>
       </w:r>
       <w:r>
         <w:rPr>
@@ -2663,18 +2822,55 @@
           <w:sz w:val="24"/>
           <w:szCs w:val="24"/>
         </w:rPr>
-        <w:t>Método que recibe 2 atributos de tipo String los cuales son las rutas de los archivos que tenemos que comparar, dicho método funciona solo si 2 archivos se llaman de la misma manera, caso contrario no funcionara, en este método es donde se manipulan los datos mencionados en el método anterior con el fin de saber cuales son las variables, clases o comentarios repetidos el cual también maneja una lista para los errores que se encuentren a lo largo de la ejecución de la aplicación.</w:t>
-      </w:r>
-    </w:p>
-    <w:p>
-      <w:pPr>
-        <w:jc w:val="both"/>
-        <w:rPr>
-          <w:rFonts w:ascii="Arial" w:hAnsi="Arial" w:cs="Arial"/>
-          <w:sz w:val="24"/>
-          <w:szCs w:val="24"/>
-        </w:rPr>
-      </w:pPr>
+        <w:t xml:space="preserve">Método que recibe 2 atributos de tipo </w:t>
+      </w:r>
+      <w:proofErr w:type="spellStart"/>
+      <w:r>
+        <w:rPr>
+          <w:rFonts w:ascii="Arial" w:hAnsi="Arial" w:cs="Arial"/>
+          <w:sz w:val="24"/>
+          <w:szCs w:val="24"/>
+        </w:rPr>
+        <w:t>String</w:t>
+      </w:r>
+      <w:proofErr w:type="spellEnd"/>
+      <w:r>
+        <w:rPr>
+          <w:rFonts w:ascii="Arial" w:hAnsi="Arial" w:cs="Arial"/>
+          <w:sz w:val="24"/>
+          <w:szCs w:val="24"/>
+        </w:rPr>
+        <w:t xml:space="preserve"> los cuales son las rutas de los archivos que tenemos que comparar, dicho método funciona solo si 2 archivos se llaman de la misma manera, caso contrario no funcionara, en este método es donde se manipulan los datos mencionados en el método anterior con el fin de saber </w:t>
+      </w:r>
+      <w:proofErr w:type="spellStart"/>
+      <w:r>
+        <w:rPr>
+          <w:rFonts w:ascii="Arial" w:hAnsi="Arial" w:cs="Arial"/>
+          <w:sz w:val="24"/>
+          <w:szCs w:val="24"/>
+        </w:rPr>
+        <w:t>cuales</w:t>
+      </w:r>
+      <w:proofErr w:type="spellEnd"/>
+      <w:r>
+        <w:rPr>
+          <w:rFonts w:ascii="Arial" w:hAnsi="Arial" w:cs="Arial"/>
+          <w:sz w:val="24"/>
+          <w:szCs w:val="24"/>
+        </w:rPr>
+        <w:t xml:space="preserve"> son las variables, clases o comentarios repetidos el cual también maneja una lista para los errores que se encuentren a lo largo de la ejecución de la aplicación.</w:t>
+      </w:r>
+    </w:p>
+    <w:p>
+      <w:pPr>
+        <w:jc w:val="both"/>
+        <w:rPr>
+          <w:rFonts w:ascii="Arial" w:hAnsi="Arial" w:cs="Arial"/>
+          <w:sz w:val="24"/>
+          <w:szCs w:val="24"/>
+        </w:rPr>
+      </w:pPr>
+      <w:proofErr w:type="spellStart"/>
       <w:r>
         <w:rPr>
           <w:rFonts w:ascii="Arial" w:hAnsi="Arial" w:cs="Arial"/>
@@ -2685,6 +2881,7 @@
         </w:rPr>
         <w:t>variables_repetidas</w:t>
       </w:r>
+      <w:proofErr w:type="spellEnd"/>
       <w:r>
         <w:rPr>
           <w:rFonts w:ascii="Arial" w:hAnsi="Arial" w:cs="Arial"/>
@@ -2713,6 +2910,7 @@
           <w:szCs w:val="24"/>
         </w:rPr>
       </w:pPr>
+      <w:proofErr w:type="spellStart"/>
       <w:r>
         <w:rPr>
           <w:rFonts w:ascii="Arial" w:hAnsi="Arial" w:cs="Arial"/>
@@ -2723,6 +2921,7 @@
         </w:rPr>
         <w:t>comentariosrepetidos</w:t>
       </w:r>
+      <w:proofErr w:type="spellEnd"/>
       <w:r>
         <w:rPr>
           <w:rFonts w:ascii="Arial" w:hAnsi="Arial" w:cs="Arial"/>
@@ -2751,6 +2950,7 @@
           <w:szCs w:val="24"/>
         </w:rPr>
       </w:pPr>
+      <w:proofErr w:type="spellStart"/>
       <w:r>
         <w:rPr>
           <w:rFonts w:ascii="Arial" w:hAnsi="Arial" w:cs="Arial"/>
@@ -2791,6 +2991,7 @@
         </w:rPr>
         <w:t>epetidas</w:t>
       </w:r>
+      <w:proofErr w:type="spellEnd"/>
       <w:r>
         <w:rPr>
           <w:rFonts w:ascii="Arial" w:hAnsi="Arial" w:cs="Arial"/>
@@ -2819,6 +3020,7 @@
           <w:szCs w:val="24"/>
         </w:rPr>
       </w:pPr>
+      <w:proofErr w:type="spellStart"/>
       <w:r>
         <w:rPr>
           <w:rFonts w:ascii="Arial" w:hAnsi="Arial" w:cs="Arial"/>
@@ -2849,6 +3051,7 @@
         </w:rPr>
         <w:t>petidos</w:t>
       </w:r>
+      <w:proofErr w:type="spellEnd"/>
       <w:r>
         <w:rPr>
           <w:rFonts w:ascii="Arial" w:hAnsi="Arial" w:cs="Arial"/>
@@ -2867,6 +3070,7 @@
           <w:szCs w:val="24"/>
         </w:rPr>
       </w:pPr>
+      <w:proofErr w:type="spellStart"/>
       <w:r>
         <w:rPr>
           <w:rFonts w:ascii="Arial" w:hAnsi="Arial" w:cs="Arial"/>
@@ -2877,6 +3081,7 @@
         </w:rPr>
         <w:t>ReporteErrores</w:t>
       </w:r>
+      <w:proofErr w:type="spellEnd"/>
       <w:r>
         <w:rPr>
           <w:rFonts w:ascii="Arial" w:hAnsi="Arial" w:cs="Arial"/>
@@ -2905,6 +3110,7 @@
           <w:szCs w:val="24"/>
         </w:rPr>
       </w:pPr>
+      <w:proofErr w:type="spellStart"/>
       <w:r>
         <w:rPr>
           <w:rFonts w:ascii="Arial" w:hAnsi="Arial" w:cs="Arial"/>
@@ -2915,6 +3121,7 @@
         </w:rPr>
         <w:t>ReporteTokens</w:t>
       </w:r>
+      <w:proofErr w:type="spellEnd"/>
       <w:r>
         <w:rPr>
           <w:rFonts w:ascii="Arial" w:hAnsi="Arial" w:cs="Arial"/>
@@ -2943,6 +3150,7 @@
           <w:szCs w:val="24"/>
         </w:rPr>
       </w:pPr>
+      <w:proofErr w:type="spellStart"/>
       <w:r>
         <w:rPr>
           <w:rFonts w:ascii="Arial" w:hAnsi="Arial" w:cs="Arial"/>
@@ -2954,6 +3162,7 @@
         <w:lastRenderedPageBreak/>
         <w:t>generar_graficaBarras</w:t>
       </w:r>
+      <w:proofErr w:type="spellEnd"/>
       <w:r>
         <w:rPr>
           <w:rFonts w:ascii="Arial" w:hAnsi="Arial" w:cs="Arial"/>
@@ -2980,15 +3189,61 @@
         </w:rPr>
         <w:t xml:space="preserve">, además de utilizar las librerías </w:t>
       </w:r>
-      <w:r>
-        <w:rPr>
-          <w:rFonts w:ascii="Arial" w:hAnsi="Arial" w:cs="Arial"/>
-          <w:b/>
-          <w:bCs/>
-          <w:sz w:val="24"/>
-          <w:szCs w:val="24"/>
-        </w:rPr>
-        <w:t>import org.jfree.chart.JFreeChart;</w:t>
+      <w:proofErr w:type="spellStart"/>
+      <w:r>
+        <w:rPr>
+          <w:rFonts w:ascii="Arial" w:hAnsi="Arial" w:cs="Arial"/>
+          <w:b/>
+          <w:bCs/>
+          <w:sz w:val="24"/>
+          <w:szCs w:val="24"/>
+        </w:rPr>
+        <w:t>import</w:t>
+      </w:r>
+      <w:proofErr w:type="spellEnd"/>
+      <w:r>
+        <w:rPr>
+          <w:rFonts w:ascii="Arial" w:hAnsi="Arial" w:cs="Arial"/>
+          <w:b/>
+          <w:bCs/>
+          <w:sz w:val="24"/>
+          <w:szCs w:val="24"/>
+        </w:rPr>
+        <w:t xml:space="preserve"> </w:t>
+      </w:r>
+      <w:proofErr w:type="spellStart"/>
+      <w:proofErr w:type="gramStart"/>
+      <w:r>
+        <w:rPr>
+          <w:rFonts w:ascii="Arial" w:hAnsi="Arial" w:cs="Arial"/>
+          <w:b/>
+          <w:bCs/>
+          <w:sz w:val="24"/>
+          <w:szCs w:val="24"/>
+        </w:rPr>
+        <w:t>org.jfree</w:t>
+      </w:r>
+      <w:proofErr w:type="gramEnd"/>
+      <w:r>
+        <w:rPr>
+          <w:rFonts w:ascii="Arial" w:hAnsi="Arial" w:cs="Arial"/>
+          <w:b/>
+          <w:bCs/>
+          <w:sz w:val="24"/>
+          <w:szCs w:val="24"/>
+        </w:rPr>
+        <w:t>.chart.JFreeChart</w:t>
+      </w:r>
+      <w:proofErr w:type="spellEnd"/>
+      <w:r>
+        <w:rPr>
+          <w:rFonts w:ascii="Arial" w:hAnsi="Arial" w:cs="Arial"/>
+          <w:b/>
+          <w:bCs/>
+          <w:sz w:val="24"/>
+          <w:szCs w:val="24"/>
+        </w:rPr>
+        <w:t>;</w:t>
       </w:r>
       <w:r>
         <w:rPr>
@@ -3000,15 +3255,49 @@
         </w:rPr>
         <w:t xml:space="preserve">, </w:t>
       </w:r>
-      <w:r>
-        <w:rPr>
-          <w:rFonts w:ascii="Arial" w:hAnsi="Arial" w:cs="Arial"/>
-          <w:b/>
-          <w:bCs/>
-          <w:sz w:val="24"/>
-          <w:szCs w:val="24"/>
-        </w:rPr>
-        <w:t>import org.jfree.chart.plot.PlotOrientation;</w:t>
+      <w:proofErr w:type="spellStart"/>
+      <w:r>
+        <w:rPr>
+          <w:rFonts w:ascii="Arial" w:hAnsi="Arial" w:cs="Arial"/>
+          <w:b/>
+          <w:bCs/>
+          <w:sz w:val="24"/>
+          <w:szCs w:val="24"/>
+        </w:rPr>
+        <w:t>import</w:t>
+      </w:r>
+      <w:proofErr w:type="spellEnd"/>
+      <w:r>
+        <w:rPr>
+          <w:rFonts w:ascii="Arial" w:hAnsi="Arial" w:cs="Arial"/>
+          <w:b/>
+          <w:bCs/>
+          <w:sz w:val="24"/>
+          <w:szCs w:val="24"/>
+        </w:rPr>
+        <w:t xml:space="preserve"> </w:t>
+      </w:r>
+      <w:proofErr w:type="spellStart"/>
+      <w:r>
+        <w:rPr>
+          <w:rFonts w:ascii="Arial" w:hAnsi="Arial" w:cs="Arial"/>
+          <w:b/>
+          <w:bCs/>
+          <w:sz w:val="24"/>
+          <w:szCs w:val="24"/>
+        </w:rPr>
+        <w:t>org.jfree.chart.plot.PlotOrientation</w:t>
+      </w:r>
+      <w:proofErr w:type="spellEnd"/>
+      <w:r>
+        <w:rPr>
+          <w:rFonts w:ascii="Arial" w:hAnsi="Arial" w:cs="Arial"/>
+          <w:b/>
+          <w:bCs/>
+          <w:sz w:val="24"/>
+          <w:szCs w:val="24"/>
+        </w:rPr>
+        <w:t>;</w:t>
       </w:r>
       <w:r>
         <w:rPr>
@@ -3020,15 +3309,49 @@
         </w:rPr>
         <w:t xml:space="preserve"> y </w:t>
       </w:r>
-      <w:r>
-        <w:rPr>
-          <w:rFonts w:ascii="Arial" w:hAnsi="Arial" w:cs="Arial"/>
-          <w:b/>
-          <w:bCs/>
-          <w:sz w:val="24"/>
-          <w:szCs w:val="24"/>
-        </w:rPr>
-        <w:t>import org.jfree.data.category.DefaultCategoryDataset;</w:t>
+      <w:proofErr w:type="spellStart"/>
+      <w:r>
+        <w:rPr>
+          <w:rFonts w:ascii="Arial" w:hAnsi="Arial" w:cs="Arial"/>
+          <w:b/>
+          <w:bCs/>
+          <w:sz w:val="24"/>
+          <w:szCs w:val="24"/>
+        </w:rPr>
+        <w:t>import</w:t>
+      </w:r>
+      <w:proofErr w:type="spellEnd"/>
+      <w:r>
+        <w:rPr>
+          <w:rFonts w:ascii="Arial" w:hAnsi="Arial" w:cs="Arial"/>
+          <w:b/>
+          <w:bCs/>
+          <w:sz w:val="24"/>
+          <w:szCs w:val="24"/>
+        </w:rPr>
+        <w:t xml:space="preserve"> </w:t>
+      </w:r>
+      <w:proofErr w:type="spellStart"/>
+      <w:r>
+        <w:rPr>
+          <w:rFonts w:ascii="Arial" w:hAnsi="Arial" w:cs="Arial"/>
+          <w:b/>
+          <w:bCs/>
+          <w:sz w:val="24"/>
+          <w:szCs w:val="24"/>
+        </w:rPr>
+        <w:t>org.jfree.data.category.DefaultCategoryDataset</w:t>
+      </w:r>
+      <w:proofErr w:type="spellEnd"/>
+      <w:r>
+        <w:rPr>
+          <w:rFonts w:ascii="Arial" w:hAnsi="Arial" w:cs="Arial"/>
+          <w:b/>
+          <w:bCs/>
+          <w:sz w:val="24"/>
+          <w:szCs w:val="24"/>
+        </w:rPr>
+        <w:t>;</w:t>
       </w:r>
       <w:r>
         <w:rPr>
@@ -3050,6 +3373,7 @@
           <w:szCs w:val="24"/>
         </w:rPr>
       </w:pPr>
+      <w:proofErr w:type="spellStart"/>
       <w:r>
         <w:rPr>
           <w:rFonts w:ascii="Arial" w:hAnsi="Arial" w:cs="Arial"/>
@@ -3060,6 +3384,7 @@
         </w:rPr>
         <w:t>generar_graficaLineas</w:t>
       </w:r>
+      <w:proofErr w:type="spellEnd"/>
       <w:r>
         <w:rPr>
           <w:rFonts w:ascii="Arial" w:hAnsi="Arial" w:cs="Arial"/>
@@ -3078,15 +3403,315 @@
         </w:rPr>
         <w:t xml:space="preserve">Este método es como el anterior, pero con la ligera diferencia de los atributos a utilizar y la ejecución de una instrucción para generar líneas en lugar de barras el cual es </w:t>
       </w:r>
-      <w:r>
-        <w:rPr>
-          <w:rFonts w:ascii="Arial" w:hAnsi="Arial" w:cs="Arial"/>
-          <w:b/>
-          <w:bCs/>
-          <w:sz w:val="24"/>
-          <w:szCs w:val="24"/>
-        </w:rPr>
-        <w:t>JFreeChart chart = ChartFactory.createXYLineChart();</w:t>
+      <w:proofErr w:type="spellStart"/>
+      <w:r>
+        <w:rPr>
+          <w:rFonts w:ascii="Arial" w:hAnsi="Arial" w:cs="Arial"/>
+          <w:b/>
+          <w:bCs/>
+          <w:sz w:val="24"/>
+          <w:szCs w:val="24"/>
+        </w:rPr>
+        <w:t>JFreeChart</w:t>
+      </w:r>
+      <w:proofErr w:type="spellEnd"/>
+      <w:r>
+        <w:rPr>
+          <w:rFonts w:ascii="Arial" w:hAnsi="Arial" w:cs="Arial"/>
+          <w:b/>
+          <w:bCs/>
+          <w:sz w:val="24"/>
+          <w:szCs w:val="24"/>
+        </w:rPr>
+        <w:t xml:space="preserve"> chart = </w:t>
+      </w:r>
+      <w:proofErr w:type="spellStart"/>
+      <w:r>
+        <w:rPr>
+          <w:rFonts w:ascii="Arial" w:hAnsi="Arial" w:cs="Arial"/>
+          <w:b/>
+          <w:bCs/>
+          <w:sz w:val="24"/>
+          <w:szCs w:val="24"/>
+        </w:rPr>
+        <w:t>ChartFactory.createXYLineChart</w:t>
+      </w:r>
+      <w:proofErr w:type="spellEnd"/>
+      <w:r>
+        <w:rPr>
+          <w:rFonts w:ascii="Arial" w:hAnsi="Arial" w:cs="Arial"/>
+          <w:b/>
+          <w:bCs/>
+          <w:sz w:val="24"/>
+          <w:szCs w:val="24"/>
+        </w:rPr>
+        <w:t>(</w:t>
+      </w:r>
+      <w:proofErr w:type="gramStart"/>
+      <w:r>
+        <w:rPr>
+          <w:rFonts w:ascii="Arial" w:hAnsi="Arial" w:cs="Arial"/>
+          <w:b/>
+          <w:bCs/>
+          <w:sz w:val="24"/>
+          <w:szCs w:val="24"/>
+        </w:rPr>
+        <w:t>);</w:t>
+      </w:r>
+      <w:r>
+        <w:rPr>
+          <w:rFonts w:ascii="Arial" w:hAnsi="Arial" w:cs="Arial"/>
+          <w:b/>
+          <w:bCs/>
+          <w:sz w:val="24"/>
+          <w:szCs w:val="24"/>
+        </w:rPr>
+        <w:t>,</w:t>
+      </w:r>
+      <w:proofErr w:type="gramEnd"/>
+      <w:r>
+        <w:rPr>
+          <w:rFonts w:ascii="Arial" w:hAnsi="Arial" w:cs="Arial"/>
+          <w:b/>
+          <w:bCs/>
+          <w:sz w:val="24"/>
+          <w:szCs w:val="24"/>
+        </w:rPr>
+        <w:t xml:space="preserve"> </w:t>
+      </w:r>
+      <w:r>
+        <w:rPr>
+          <w:rFonts w:ascii="Arial" w:hAnsi="Arial" w:cs="Arial"/>
+          <w:sz w:val="24"/>
+          <w:szCs w:val="24"/>
+        </w:rPr>
+        <w:t xml:space="preserve">el cual recibe dentro de los paréntesis la información de la </w:t>
+      </w:r>
+      <w:proofErr w:type="spellStart"/>
+      <w:r>
+        <w:rPr>
+          <w:rFonts w:ascii="Arial" w:hAnsi="Arial" w:cs="Arial"/>
+          <w:sz w:val="24"/>
+          <w:szCs w:val="24"/>
+        </w:rPr>
+        <w:t>grafica</w:t>
+      </w:r>
+      <w:proofErr w:type="spellEnd"/>
+      <w:r>
+        <w:rPr>
+          <w:rFonts w:ascii="Arial" w:hAnsi="Arial" w:cs="Arial"/>
+          <w:sz w:val="24"/>
+          <w:szCs w:val="24"/>
+        </w:rPr>
+        <w:t xml:space="preserve"> como lo es: </w:t>
+      </w:r>
+      <w:proofErr w:type="spellStart"/>
+      <w:r>
+        <w:rPr>
+          <w:rFonts w:ascii="Arial" w:hAnsi="Arial" w:cs="Arial"/>
+          <w:b/>
+          <w:bCs/>
+          <w:sz w:val="24"/>
+          <w:szCs w:val="24"/>
+        </w:rPr>
+        <w:t>titulo</w:t>
+      </w:r>
+      <w:proofErr w:type="spellEnd"/>
+      <w:r>
+        <w:rPr>
+          <w:rFonts w:ascii="Arial" w:hAnsi="Arial" w:cs="Arial"/>
+          <w:b/>
+          <w:bCs/>
+          <w:sz w:val="24"/>
+          <w:szCs w:val="24"/>
+        </w:rPr>
+        <w:t xml:space="preserve"> de la gráfica, nombre del archivo y la puntuación.</w:t>
+      </w:r>
+    </w:p>
+    <w:p>
+      <w:pPr>
+        <w:jc w:val="both"/>
+        <w:rPr>
+          <w:rFonts w:ascii="Arial" w:hAnsi="Arial" w:cs="Arial"/>
+          <w:b/>
+          <w:bCs/>
+          <w:sz w:val="24"/>
+          <w:szCs w:val="24"/>
+        </w:rPr>
+      </w:pPr>
+      <w:proofErr w:type="spellStart"/>
+      <w:r>
+        <w:rPr>
+          <w:rFonts w:ascii="Arial" w:hAnsi="Arial" w:cs="Arial"/>
+          <w:b/>
+          <w:bCs/>
+          <w:sz w:val="24"/>
+          <w:szCs w:val="24"/>
+        </w:rPr>
+        <w:t>generar_graficaPie</w:t>
+      </w:r>
+      <w:proofErr w:type="spellEnd"/>
+      <w:r>
+        <w:rPr>
+          <w:rFonts w:ascii="Arial" w:hAnsi="Arial" w:cs="Arial"/>
+          <w:b/>
+          <w:bCs/>
+          <w:sz w:val="24"/>
+          <w:szCs w:val="24"/>
+        </w:rPr>
+        <w:t xml:space="preserve">: </w:t>
+      </w:r>
+      <w:r>
+        <w:rPr>
+          <w:rFonts w:ascii="Arial" w:hAnsi="Arial" w:cs="Arial"/>
+          <w:sz w:val="24"/>
+          <w:szCs w:val="24"/>
+        </w:rPr>
+        <w:t xml:space="preserve">Este método es como los dos anteriores, pero a diferencia de las otras gráficas, esta genera una gráfica de pie, utilizando la </w:t>
+      </w:r>
+      <w:r>
+        <w:rPr>
+          <w:rFonts w:ascii="Arial" w:hAnsi="Arial" w:cs="Arial"/>
+          <w:sz w:val="24"/>
+          <w:szCs w:val="24"/>
+        </w:rPr>
+        <w:t xml:space="preserve">función </w:t>
+      </w:r>
+      <w:proofErr w:type="spellStart"/>
+      <w:r>
+        <w:rPr>
+          <w:rFonts w:ascii="Arial" w:hAnsi="Arial" w:cs="Arial"/>
+          <w:b/>
+          <w:bCs/>
+          <w:sz w:val="24"/>
+          <w:szCs w:val="24"/>
+        </w:rPr>
+        <w:t>JFreeChart</w:t>
+      </w:r>
+      <w:proofErr w:type="spellEnd"/>
+      <w:r>
+        <w:rPr>
+          <w:rFonts w:ascii="Arial" w:hAnsi="Arial" w:cs="Arial"/>
+          <w:b/>
+          <w:bCs/>
+          <w:sz w:val="24"/>
+          <w:szCs w:val="24"/>
+        </w:rPr>
+        <w:t xml:space="preserve"> grafico= </w:t>
+      </w:r>
+      <w:proofErr w:type="spellStart"/>
+      <w:r>
+        <w:rPr>
+          <w:rFonts w:ascii="Arial" w:hAnsi="Arial" w:cs="Arial"/>
+          <w:b/>
+          <w:bCs/>
+          <w:sz w:val="24"/>
+          <w:szCs w:val="24"/>
+        </w:rPr>
+        <w:t>ChartFactory.createPieChart</w:t>
+      </w:r>
+      <w:proofErr w:type="spellEnd"/>
+      <w:r>
+        <w:rPr>
+          <w:rFonts w:ascii="Arial" w:hAnsi="Arial" w:cs="Arial"/>
+          <w:b/>
+          <w:bCs/>
+          <w:sz w:val="24"/>
+          <w:szCs w:val="24"/>
+        </w:rPr>
+        <w:t>(</w:t>
+      </w:r>
+      <w:proofErr w:type="gramStart"/>
+      <w:r>
+        <w:rPr>
+          <w:rFonts w:ascii="Arial" w:hAnsi="Arial" w:cs="Arial"/>
+          <w:b/>
+          <w:bCs/>
+          <w:sz w:val="24"/>
+          <w:szCs w:val="24"/>
+        </w:rPr>
+        <w:t>);,</w:t>
+      </w:r>
+      <w:proofErr w:type="gramEnd"/>
+      <w:r>
+        <w:rPr>
+          <w:rFonts w:ascii="Arial" w:hAnsi="Arial" w:cs="Arial"/>
+          <w:b/>
+          <w:bCs/>
+          <w:sz w:val="24"/>
+          <w:szCs w:val="24"/>
+        </w:rPr>
+        <w:t xml:space="preserve"> </w:t>
+      </w:r>
+      <w:r>
+        <w:rPr>
+          <w:rFonts w:ascii="Arial" w:hAnsi="Arial" w:cs="Arial"/>
+          <w:sz w:val="24"/>
+          <w:szCs w:val="24"/>
+        </w:rPr>
+        <w:t xml:space="preserve">el cual recibe dentro de los paréntesis: </w:t>
+      </w:r>
+      <w:proofErr w:type="spellStart"/>
+      <w:r>
+        <w:rPr>
+          <w:rFonts w:ascii="Arial" w:hAnsi="Arial" w:cs="Arial"/>
+          <w:b/>
+          <w:bCs/>
+          <w:sz w:val="24"/>
+          <w:szCs w:val="24"/>
+        </w:rPr>
+        <w:t>titulo</w:t>
+      </w:r>
+      <w:proofErr w:type="spellEnd"/>
+      <w:r>
+        <w:rPr>
+          <w:rFonts w:ascii="Arial" w:hAnsi="Arial" w:cs="Arial"/>
+          <w:b/>
+          <w:bCs/>
+          <w:sz w:val="24"/>
+          <w:szCs w:val="24"/>
+        </w:rPr>
+        <w:t xml:space="preserve"> de la gráfica, y los datos necesarios para graficar</w:t>
+      </w:r>
+    </w:p>
+    <w:p>
+      <w:pPr>
+        <w:jc w:val="both"/>
+        <w:rPr>
+          <w:rFonts w:ascii="Arial" w:hAnsi="Arial" w:cs="Arial"/>
+          <w:b/>
+          <w:bCs/>
+          <w:sz w:val="24"/>
+          <w:szCs w:val="24"/>
+        </w:rPr>
+      </w:pPr>
+      <w:r>
+        <w:rPr>
+          <w:rFonts w:ascii="Arial" w:hAnsi="Arial" w:cs="Arial"/>
+          <w:b/>
+          <w:bCs/>
+          <w:sz w:val="24"/>
+          <w:szCs w:val="24"/>
+        </w:rPr>
+        <w:t xml:space="preserve">Archivo: </w:t>
+      </w:r>
+      <w:r>
+        <w:rPr>
+          <w:rFonts w:ascii="Arial" w:hAnsi="Arial" w:cs="Arial"/>
+          <w:sz w:val="24"/>
+          <w:szCs w:val="24"/>
+        </w:rPr>
+        <w:t xml:space="preserve">Este método recibe como parámetros el nombre del archivo, y luego diversas listas ya sea de variables, comentarios, clases, métodos, entre otras, con el fin de llevar el control de los datos repetidos que se encuentran en los archivos a comparar, dicho método es invocado y utilizado en el método de </w:t>
+      </w:r>
+      <w:r>
+        <w:rPr>
+          <w:rFonts w:ascii="Arial" w:hAnsi="Arial" w:cs="Arial"/>
+          <w:b/>
+          <w:bCs/>
+          <w:sz w:val="24"/>
+          <w:szCs w:val="24"/>
+        </w:rPr>
+        <w:t>Comparamos</w:t>
       </w:r>
       <w:r>
         <w:rPr>
@@ -3098,160 +3723,38 @@
         </w:rPr>
         <w:t xml:space="preserve">, </w:t>
       </w:r>
-      <w:r>
-        <w:rPr>
-          <w:rFonts w:ascii="Arial" w:hAnsi="Arial" w:cs="Arial"/>
-          <w:sz w:val="24"/>
-          <w:szCs w:val="24"/>
-        </w:rPr>
-        <w:t xml:space="preserve">el cual recibe dentro de los paréntesis la información de la grafica como lo es: </w:t>
-      </w:r>
-      <w:r>
-        <w:rPr>
-          <w:rFonts w:ascii="Arial" w:hAnsi="Arial" w:cs="Arial"/>
-          <w:b/>
-          <w:bCs/>
-          <w:sz w:val="24"/>
-          <w:szCs w:val="24"/>
-        </w:rPr>
-        <w:t>titulo de la gráfica, nombre del archivo y la puntuación.</w:t>
-      </w:r>
-    </w:p>
-    <w:p>
-      <w:pPr>
-        <w:jc w:val="both"/>
-        <w:rPr>
-          <w:rFonts w:ascii="Arial" w:hAnsi="Arial" w:cs="Arial"/>
-          <w:b/>
-          <w:bCs/>
-          <w:sz w:val="24"/>
-          <w:szCs w:val="24"/>
-        </w:rPr>
-      </w:pPr>
-      <w:r>
-        <w:rPr>
-          <w:rFonts w:ascii="Arial" w:hAnsi="Arial" w:cs="Arial"/>
-          <w:b/>
-          <w:bCs/>
-          <w:sz w:val="24"/>
-          <w:szCs w:val="24"/>
-        </w:rPr>
-        <w:t>generar_graficaPie</w:t>
-      </w:r>
-      <w:r>
-        <w:rPr>
-          <w:rFonts w:ascii="Arial" w:hAnsi="Arial" w:cs="Arial"/>
-          <w:b/>
-          <w:bCs/>
-          <w:sz w:val="24"/>
-          <w:szCs w:val="24"/>
-        </w:rPr>
-        <w:t xml:space="preserve">: </w:t>
-      </w:r>
-      <w:r>
-        <w:rPr>
-          <w:rFonts w:ascii="Arial" w:hAnsi="Arial" w:cs="Arial"/>
-          <w:sz w:val="24"/>
-          <w:szCs w:val="24"/>
-        </w:rPr>
-        <w:t xml:space="preserve">Este método es como los dos anteriores, pero a diferencia de las otras gráficas, esta genera una gráfica de pie, utilizando la </w:t>
-      </w:r>
-      <w:r>
-        <w:rPr>
-          <w:rFonts w:ascii="Arial" w:hAnsi="Arial" w:cs="Arial"/>
-          <w:sz w:val="24"/>
-          <w:szCs w:val="24"/>
-        </w:rPr>
-        <w:t xml:space="preserve">función </w:t>
-      </w:r>
-      <w:r>
-        <w:rPr>
-          <w:rFonts w:ascii="Arial" w:hAnsi="Arial" w:cs="Arial"/>
-          <w:b/>
-          <w:bCs/>
-          <w:sz w:val="24"/>
-          <w:szCs w:val="24"/>
-        </w:rPr>
-        <w:t>JFreeChart</w:t>
-      </w:r>
-      <w:r>
-        <w:rPr>
-          <w:rFonts w:ascii="Arial" w:hAnsi="Arial" w:cs="Arial"/>
-          <w:b/>
-          <w:bCs/>
-          <w:sz w:val="24"/>
-          <w:szCs w:val="24"/>
-        </w:rPr>
-        <w:t xml:space="preserve"> grafico= ChartFactory.createPieChart</w:t>
-      </w:r>
-      <w:r>
-        <w:rPr>
-          <w:rFonts w:ascii="Arial" w:hAnsi="Arial" w:cs="Arial"/>
-          <w:b/>
-          <w:bCs/>
-          <w:sz w:val="24"/>
-          <w:szCs w:val="24"/>
-        </w:rPr>
-        <w:t xml:space="preserve">();, </w:t>
-      </w:r>
-      <w:r>
-        <w:rPr>
-          <w:rFonts w:ascii="Arial" w:hAnsi="Arial" w:cs="Arial"/>
-          <w:sz w:val="24"/>
-          <w:szCs w:val="24"/>
-        </w:rPr>
-        <w:t xml:space="preserve">el cual recibe dentro de los paréntesis: </w:t>
-      </w:r>
-      <w:r>
-        <w:rPr>
-          <w:rFonts w:ascii="Arial" w:hAnsi="Arial" w:cs="Arial"/>
-          <w:b/>
-          <w:bCs/>
-          <w:sz w:val="24"/>
-          <w:szCs w:val="24"/>
-        </w:rPr>
-        <w:t>titulo de la gráfica, y los datos necesarios para graficar</w:t>
-      </w:r>
-    </w:p>
-    <w:p>
-      <w:pPr>
-        <w:jc w:val="both"/>
-        <w:rPr>
-          <w:rFonts w:ascii="Arial" w:hAnsi="Arial" w:cs="Arial"/>
-          <w:b/>
-          <w:bCs/>
-          <w:sz w:val="24"/>
-          <w:szCs w:val="24"/>
-        </w:rPr>
-      </w:pPr>
-      <w:r>
-        <w:rPr>
-          <w:rFonts w:ascii="Arial" w:hAnsi="Arial" w:cs="Arial"/>
-          <w:b/>
-          <w:bCs/>
-          <w:sz w:val="24"/>
-          <w:szCs w:val="24"/>
-        </w:rPr>
-        <w:t xml:space="preserve">Archivo: </w:t>
-      </w:r>
-      <w:r>
-        <w:rPr>
-          <w:rFonts w:ascii="Arial" w:hAnsi="Arial" w:cs="Arial"/>
-          <w:sz w:val="24"/>
-          <w:szCs w:val="24"/>
-        </w:rPr>
-        <w:t xml:space="preserve">Este método recibe como parámetros el nombre del archivo, y luego diversas listas ya sea de variables, comentarios, clases, métodos, entre otras, con el fin de llevar el control de los datos repetidos que se encuentran en los archivos a comparar, dicho método es invocado y utilizado en el método de </w:t>
-      </w:r>
-      <w:r>
-        <w:rPr>
-          <w:rFonts w:ascii="Arial" w:hAnsi="Arial" w:cs="Arial"/>
-          <w:b/>
-          <w:bCs/>
-          <w:sz w:val="24"/>
-          <w:szCs w:val="24"/>
-        </w:rPr>
-        <w:t>Comparamos</w:t>
-      </w:r>
+      <w:proofErr w:type="spellStart"/>
+      <w:r>
+        <w:rPr>
+          <w:rFonts w:ascii="Arial" w:hAnsi="Arial" w:cs="Arial"/>
+          <w:b/>
+          <w:bCs/>
+          <w:sz w:val="24"/>
+          <w:szCs w:val="24"/>
+        </w:rPr>
+        <w:t>Metodos</w:t>
+      </w:r>
+      <w:r>
+        <w:rPr>
+          <w:rFonts w:ascii="Arial" w:hAnsi="Arial" w:cs="Arial"/>
+          <w:b/>
+          <w:bCs/>
+          <w:sz w:val="24"/>
+          <w:szCs w:val="24"/>
+        </w:rPr>
+        <w:t>Re</w:t>
+      </w:r>
+      <w:r>
+        <w:rPr>
+          <w:rFonts w:ascii="Arial" w:hAnsi="Arial" w:cs="Arial"/>
+          <w:b/>
+          <w:bCs/>
+          <w:sz w:val="24"/>
+          <w:szCs w:val="24"/>
+        </w:rPr>
+        <w:t>petidos</w:t>
+      </w:r>
+      <w:proofErr w:type="spellEnd"/>
       <w:r>
         <w:rPr>
           <w:rFonts w:ascii="Arial" w:hAnsi="Arial" w:cs="Arial"/>
@@ -3262,36 +3765,48 @@
         </w:rPr>
         <w:t xml:space="preserve">, </w:t>
       </w:r>
-      <w:r>
-        <w:rPr>
-          <w:rFonts w:ascii="Arial" w:hAnsi="Arial" w:cs="Arial"/>
-          <w:b/>
-          <w:bCs/>
-          <w:sz w:val="24"/>
-          <w:szCs w:val="24"/>
-        </w:rPr>
-        <w:t>Metodos</w:t>
-      </w:r>
-      <w:r>
-        <w:rPr>
-          <w:rFonts w:ascii="Arial" w:hAnsi="Arial" w:cs="Arial"/>
-          <w:b/>
-          <w:bCs/>
-          <w:sz w:val="24"/>
-          <w:szCs w:val="24"/>
-        </w:rPr>
-        <w:t>Re</w:t>
-      </w:r>
-      <w:r>
-        <w:rPr>
-          <w:rFonts w:ascii="Arial" w:hAnsi="Arial" w:cs="Arial"/>
-          <w:b/>
-          <w:bCs/>
-          <w:sz w:val="24"/>
-          <w:szCs w:val="24"/>
-        </w:rPr>
-        <w:t>petidos</w:t>
-      </w:r>
+      <w:proofErr w:type="spellStart"/>
+      <w:r>
+        <w:rPr>
+          <w:rFonts w:ascii="Arial" w:hAnsi="Arial" w:cs="Arial"/>
+          <w:b/>
+          <w:bCs/>
+          <w:sz w:val="24"/>
+          <w:szCs w:val="24"/>
+        </w:rPr>
+        <w:t>C</w:t>
+      </w:r>
+      <w:r>
+        <w:rPr>
+          <w:rFonts w:ascii="Arial" w:hAnsi="Arial" w:cs="Arial"/>
+          <w:b/>
+          <w:bCs/>
+          <w:sz w:val="24"/>
+          <w:szCs w:val="24"/>
+        </w:rPr>
+        <w:t>lases</w:t>
+      </w:r>
+      <w:r>
+        <w:rPr>
+          <w:rFonts w:ascii="Arial" w:hAnsi="Arial" w:cs="Arial"/>
+          <w:b/>
+          <w:bCs/>
+          <w:sz w:val="24"/>
+          <w:szCs w:val="24"/>
+        </w:rPr>
+        <w:t>R</w:t>
+      </w:r>
+      <w:r>
+        <w:rPr>
+          <w:rFonts w:ascii="Arial" w:hAnsi="Arial" w:cs="Arial"/>
+          <w:b/>
+          <w:bCs/>
+          <w:sz w:val="24"/>
+          <w:szCs w:val="24"/>
+        </w:rPr>
+        <w:t>epetidas</w:t>
+      </w:r>
+      <w:proofErr w:type="spellEnd"/>
       <w:r>
         <w:rPr>
           <w:rFonts w:ascii="Arial" w:hAnsi="Arial" w:cs="Arial"/>
@@ -3302,56 +3817,7 @@
         </w:rPr>
         <w:t xml:space="preserve">, </w:t>
       </w:r>
-      <w:r>
-        <w:rPr>
-          <w:rFonts w:ascii="Arial" w:hAnsi="Arial" w:cs="Arial"/>
-          <w:b/>
-          <w:bCs/>
-          <w:sz w:val="24"/>
-          <w:szCs w:val="24"/>
-        </w:rPr>
-        <w:t>C</w:t>
-      </w:r>
-      <w:r>
-        <w:rPr>
-          <w:rFonts w:ascii="Arial" w:hAnsi="Arial" w:cs="Arial"/>
-          <w:b/>
-          <w:bCs/>
-          <w:sz w:val="24"/>
-          <w:szCs w:val="24"/>
-        </w:rPr>
-        <w:t>lases</w:t>
-      </w:r>
-      <w:r>
-        <w:rPr>
-          <w:rFonts w:ascii="Arial" w:hAnsi="Arial" w:cs="Arial"/>
-          <w:b/>
-          <w:bCs/>
-          <w:sz w:val="24"/>
-          <w:szCs w:val="24"/>
-        </w:rPr>
-        <w:t>R</w:t>
-      </w:r>
-      <w:r>
-        <w:rPr>
-          <w:rFonts w:ascii="Arial" w:hAnsi="Arial" w:cs="Arial"/>
-          <w:b/>
-          <w:bCs/>
-          <w:sz w:val="24"/>
-          <w:szCs w:val="24"/>
-        </w:rPr>
-        <w:t>epetidas</w:t>
-      </w:r>
-      <w:r>
-        <w:rPr>
-          <w:rFonts w:ascii="Arial" w:hAnsi="Arial" w:cs="Arial"/>
-          <w:b/>
-          <w:bCs/>
-          <w:sz w:val="24"/>
-          <w:szCs w:val="24"/>
-        </w:rPr>
-        <w:t xml:space="preserve">, </w:t>
-      </w:r>
+      <w:proofErr w:type="spellStart"/>
       <w:r>
         <w:rPr>
           <w:rFonts w:ascii="Arial" w:hAnsi="Arial" w:cs="Arial"/>
@@ -3362,6 +3828,7 @@
         </w:rPr>
         <w:t>comentariosrepetidos</w:t>
       </w:r>
+      <w:proofErr w:type="spellEnd"/>
       <w:r>
         <w:rPr>
           <w:rFonts w:ascii="Arial" w:hAnsi="Arial" w:cs="Arial"/>
@@ -3372,6 +3839,7 @@
         </w:rPr>
         <w:t xml:space="preserve"> y </w:t>
       </w:r>
+      <w:proofErr w:type="spellStart"/>
       <w:r>
         <w:rPr>
           <w:rFonts w:ascii="Arial" w:hAnsi="Arial" w:cs="Arial"/>
@@ -3382,6 +3850,7 @@
         </w:rPr>
         <w:t>variables_repetidas</w:t>
       </w:r>
+      <w:proofErr w:type="spellEnd"/>
     </w:p>
     <w:sectPr>
       <w:pgSz w:w="11906" w:h="16838"/>

</xml_diff>

<commit_message>
Commit final, se agregaron varias clases, varios metodos, varias modificaciones para generar los graficos y ademas agregarlos al reporte
</commit_message>
<xml_diff>
--- a/ManualTecnico.docx
+++ b/ManualTecnico.docx
@@ -20,19 +20,8 @@
           <w:szCs w:val="24"/>
           <w:lang w:val="es-GT"/>
         </w:rPr>
-        <w:t xml:space="preserve">Nombre: Luis Antonio Cutzal </w:t>
-      </w:r>
-      <w:proofErr w:type="spellStart"/>
-      <w:r>
-        <w:rPr>
-          <w:rFonts w:ascii="Arial" w:hAnsi="Arial" w:cs="Arial"/>
-          <w:sz w:val="24"/>
-          <w:szCs w:val="24"/>
-          <w:lang w:val="es-GT"/>
-        </w:rPr>
-        <w:t>Chali</w:t>
-      </w:r>
-      <w:proofErr w:type="spellEnd"/>
+        <w:t>Nombre: Luis Antonio Cutzal Chali</w:t>
+      </w:r>
       <w:r>
         <w:rPr>
           <w:rFonts w:ascii="Arial" w:hAnsi="Arial" w:cs="Arial"/>
@@ -87,7 +76,7 @@
           <w:szCs w:val="56"/>
           <w:lang w:val="es-GT"/>
         </w:rPr>
-        <w:t>B</w:t>
+        <w:t>C</w:t>
       </w:r>
     </w:p>
     <w:p>
@@ -550,18 +539,8 @@
           <w:sz w:val="24"/>
           <w:szCs w:val="24"/>
         </w:rPr>
-        <w:t xml:space="preserve">Kevin </w:t>
-      </w:r>
-      <w:proofErr w:type="spellStart"/>
-      <w:r>
-        <w:rPr>
-          <w:rFonts w:ascii="Arial" w:hAnsi="Arial" w:cs="Arial"/>
-          <w:sz w:val="24"/>
-          <w:szCs w:val="24"/>
-        </w:rPr>
-        <w:t>Lajpop</w:t>
-      </w:r>
-      <w:proofErr w:type="spellEnd"/>
+        <w:t>Kevin Lajpop</w:t>
+      </w:r>
       <w:r>
         <w:rPr>
           <w:rFonts w:ascii="Arial" w:hAnsi="Arial" w:cs="Arial"/>
@@ -664,25 +643,7 @@
           <w:sz w:val="24"/>
           <w:szCs w:val="24"/>
         </w:rPr>
-        <w:t xml:space="preserve">De acuerdo con el enunciado del Proyecto 1, se </w:t>
-      </w:r>
-      <w:proofErr w:type="spellStart"/>
-      <w:r>
-        <w:rPr>
-          <w:rFonts w:ascii="Arial" w:hAnsi="Arial" w:cs="Arial"/>
-          <w:sz w:val="24"/>
-          <w:szCs w:val="24"/>
-        </w:rPr>
-        <w:t>creo</w:t>
-      </w:r>
-      <w:proofErr w:type="spellEnd"/>
-      <w:r>
-        <w:rPr>
-          <w:rFonts w:ascii="Arial" w:hAnsi="Arial" w:cs="Arial"/>
-          <w:sz w:val="24"/>
-          <w:szCs w:val="24"/>
-        </w:rPr>
-        <w:t xml:space="preserve"> una herramienta el cual servirá de apoyo a los tutores académicos en el análisis del código fuente de los diferentes proyectos desarrollados por los estudiantes con el fin de agilizar los procesos de búsqueda de copias.</w:t>
+        <w:t>De acuerdo con el enunciado del Proyecto 1, se creo una herramienta el cual servirá de apoyo a los tutores académicos en el análisis del código fuente de los diferentes proyectos desarrollados por los estudiantes con el fin de agilizar los procesos de búsqueda de copias.</w:t>
       </w:r>
     </w:p>
     <w:p>
@@ -778,29 +739,7 @@
           <w:sz w:val="24"/>
           <w:szCs w:val="24"/>
         </w:rPr>
-        <w:t xml:space="preserve"> 8.2 o Apache NetBeans 12.4, esto para poder ejecutar la herramienta, en caso de no tener alguno de los 2 </w:t>
-      </w:r>
-      <w:proofErr w:type="spellStart"/>
-      <w:r>
-        <w:rPr>
-          <w:rFonts w:ascii="Arial" w:hAnsi="Arial" w:cs="Arial"/>
-          <w:b/>
-          <w:bCs/>
-          <w:sz w:val="24"/>
-          <w:szCs w:val="24"/>
-        </w:rPr>
-        <w:t>IDE´s</w:t>
-      </w:r>
-      <w:proofErr w:type="spellEnd"/>
-      <w:r>
-        <w:rPr>
-          <w:rFonts w:ascii="Arial" w:hAnsi="Arial" w:cs="Arial"/>
-          <w:b/>
-          <w:bCs/>
-          <w:sz w:val="24"/>
-          <w:szCs w:val="24"/>
-        </w:rPr>
-        <w:t xml:space="preserve"> deberá descargarlo desde la página oficial.</w:t>
+        <w:t xml:space="preserve"> 8.2 o Apache NetBeans 12.4, esto para poder ejecutar la herramienta, en caso de no tener alguno de los 2 IDE´s deberá descargarlo desde la página oficial.</w:t>
       </w:r>
     </w:p>
     <w:p>
@@ -1169,25 +1108,7 @@
           <w:sz w:val="24"/>
           <w:szCs w:val="24"/>
         </w:rPr>
-        <w:t xml:space="preserve">l </w:t>
-      </w:r>
-      <w:proofErr w:type="spellStart"/>
-      <w:r>
-        <w:rPr>
-          <w:rFonts w:ascii="Arial" w:hAnsi="Arial" w:cs="Arial"/>
-          <w:sz w:val="24"/>
-          <w:szCs w:val="24"/>
-        </w:rPr>
-        <w:t>main</w:t>
-      </w:r>
-      <w:proofErr w:type="spellEnd"/>
-      <w:r>
-        <w:rPr>
-          <w:rFonts w:ascii="Arial" w:hAnsi="Arial" w:cs="Arial"/>
-          <w:sz w:val="24"/>
-          <w:szCs w:val="24"/>
-        </w:rPr>
-        <w:t xml:space="preserve"> el cual ejecuta la ventana de la aplicación.</w:t>
+        <w:t>l main el cual ejecuta la ventana de la aplicación.</w:t>
       </w:r>
     </w:p>
     <w:p>
@@ -1629,7 +1550,6 @@
         </w:rPr>
         <w:t xml:space="preserve">Clase utilizada en el archivo </w:t>
       </w:r>
-      <w:proofErr w:type="spellStart"/>
       <w:r>
         <w:rPr>
           <w:rFonts w:ascii="Arial" w:hAnsi="Arial" w:cs="Arial"/>
@@ -1640,7 +1560,6 @@
         </w:rPr>
         <w:t>Analizador_Sintactico.cup</w:t>
       </w:r>
-      <w:proofErr w:type="spellEnd"/>
       <w:r>
         <w:rPr>
           <w:rFonts w:ascii="Arial" w:hAnsi="Arial" w:cs="Arial"/>
@@ -1727,7 +1646,6 @@
         </w:rPr>
         <w:t xml:space="preserve"> </w:t>
       </w:r>
-      <w:proofErr w:type="spellStart"/>
       <w:r>
         <w:rPr>
           <w:rFonts w:ascii="Arial" w:hAnsi="Arial" w:cs="Arial"/>
@@ -1738,7 +1656,6 @@
         </w:rPr>
         <w:t>ASintactico.cup</w:t>
       </w:r>
-      <w:proofErr w:type="spellEnd"/>
       <w:r>
         <w:rPr>
           <w:rFonts w:ascii="Arial" w:hAnsi="Arial" w:cs="Arial"/>
@@ -1819,7 +1736,6 @@
         </w:rPr>
         <w:t xml:space="preserve"> </w:t>
       </w:r>
-      <w:proofErr w:type="spellStart"/>
       <w:r>
         <w:rPr>
           <w:rFonts w:ascii="Arial" w:hAnsi="Arial" w:cs="Arial"/>
@@ -1830,7 +1746,6 @@
         </w:rPr>
         <w:t>ALexico.jflex</w:t>
       </w:r>
-      <w:proofErr w:type="spellEnd"/>
       <w:r>
         <w:rPr>
           <w:rFonts w:ascii="Arial" w:hAnsi="Arial" w:cs="Arial"/>
@@ -1901,7 +1816,6 @@
         </w:rPr>
         <w:t xml:space="preserve"> </w:t>
       </w:r>
-      <w:proofErr w:type="spellStart"/>
       <w:r>
         <w:rPr>
           <w:rFonts w:ascii="Arial" w:hAnsi="Arial" w:cs="Arial"/>
@@ -1912,7 +1826,6 @@
         </w:rPr>
         <w:t>Analizador_Sintactico.cup</w:t>
       </w:r>
-      <w:proofErr w:type="spellEnd"/>
       <w:r>
         <w:rPr>
           <w:rFonts w:ascii="Arial" w:hAnsi="Arial" w:cs="Arial"/>
@@ -1971,7 +1884,6 @@
         </w:rPr>
         <w:t xml:space="preserve">Generador de la clase </w:t>
       </w:r>
-      <w:proofErr w:type="spellStart"/>
       <w:r>
         <w:rPr>
           <w:rFonts w:ascii="Arial" w:hAnsi="Arial" w:cs="Arial"/>
@@ -1982,7 +1894,6 @@
         </w:rPr>
         <w:t>Analizador_Lexico.jflex</w:t>
       </w:r>
-      <w:proofErr w:type="spellEnd"/>
       <w:r>
         <w:rPr>
           <w:rFonts w:ascii="Arial" w:hAnsi="Arial" w:cs="Arial"/>
@@ -2041,7 +1952,6 @@
         </w:rPr>
         <w:t xml:space="preserve">Clase que contiene todas las producciones en lenguaje java de los archivos </w:t>
       </w:r>
-      <w:proofErr w:type="spellStart"/>
       <w:r>
         <w:rPr>
           <w:rFonts w:ascii="Arial" w:hAnsi="Arial" w:cs="Arial"/>
@@ -2052,7 +1962,6 @@
         </w:rPr>
         <w:t>ASintactico.cup</w:t>
       </w:r>
-      <w:proofErr w:type="spellEnd"/>
       <w:r>
         <w:rPr>
           <w:rFonts w:ascii="Arial" w:hAnsi="Arial" w:cs="Arial"/>
@@ -2063,7 +1972,6 @@
         </w:rPr>
         <w:t xml:space="preserve"> y </w:t>
       </w:r>
-      <w:proofErr w:type="spellStart"/>
       <w:r>
         <w:rPr>
           <w:rFonts w:ascii="Arial" w:hAnsi="Arial" w:cs="Arial"/>
@@ -2074,7 +1982,6 @@
         </w:rPr>
         <w:t>Analizador_Sintactico.cup</w:t>
       </w:r>
-      <w:proofErr w:type="spellEnd"/>
       <w:r>
         <w:rPr>
           <w:rFonts w:ascii="Arial" w:hAnsi="Arial" w:cs="Arial"/>
@@ -2177,7 +2084,6 @@
           <w:szCs w:val="24"/>
         </w:rPr>
       </w:pPr>
-      <w:proofErr w:type="spellStart"/>
       <w:r>
         <w:rPr>
           <w:rFonts w:ascii="Arial" w:hAnsi="Arial" w:cs="Arial"/>
@@ -2188,7 +2094,6 @@
         </w:rPr>
         <w:t>ASintactico.cup</w:t>
       </w:r>
-      <w:proofErr w:type="spellEnd"/>
       <w:r>
         <w:rPr>
           <w:rFonts w:ascii="Arial" w:hAnsi="Arial" w:cs="Arial"/>
@@ -2217,7 +2122,6 @@
           <w:szCs w:val="24"/>
         </w:rPr>
       </w:pPr>
-      <w:proofErr w:type="spellStart"/>
       <w:r>
         <w:rPr>
           <w:rFonts w:ascii="Arial" w:hAnsi="Arial" w:cs="Arial"/>
@@ -2228,7 +2132,6 @@
         </w:rPr>
         <w:t>ALexico.jflex</w:t>
       </w:r>
-      <w:proofErr w:type="spellEnd"/>
       <w:r>
         <w:rPr>
           <w:rFonts w:ascii="Arial" w:hAnsi="Arial" w:cs="Arial"/>
@@ -2343,7 +2246,6 @@
           <w:szCs w:val="24"/>
         </w:rPr>
       </w:pPr>
-      <w:proofErr w:type="spellStart"/>
       <w:r>
         <w:rPr>
           <w:rFonts w:ascii="Arial" w:hAnsi="Arial" w:cs="Arial"/>
@@ -2354,7 +2256,6 @@
         </w:rPr>
         <w:t>Analizador_Sintactico.cup</w:t>
       </w:r>
-      <w:proofErr w:type="spellEnd"/>
       <w:r>
         <w:rPr>
           <w:rFonts w:ascii="Arial" w:hAnsi="Arial" w:cs="Arial"/>
@@ -2391,7 +2292,6 @@
           <w:szCs w:val="24"/>
         </w:rPr>
       </w:pPr>
-      <w:proofErr w:type="spellStart"/>
       <w:r>
         <w:rPr>
           <w:rFonts w:ascii="Arial" w:hAnsi="Arial" w:cs="Arial"/>
@@ -2402,7 +2302,6 @@
         </w:rPr>
         <w:t>Analizador_Lexico.jflex</w:t>
       </w:r>
-      <w:proofErr w:type="spellEnd"/>
       <w:r>
         <w:rPr>
           <w:rFonts w:ascii="Arial" w:hAnsi="Arial" w:cs="Arial"/>
@@ -2674,25 +2573,7 @@
           <w:sz w:val="24"/>
           <w:szCs w:val="24"/>
         </w:rPr>
-        <w:t xml:space="preserve">Generará un archivo el cual contendrá un resumen de las </w:t>
-      </w:r>
-      <w:proofErr w:type="spellStart"/>
-      <w:r>
-        <w:rPr>
-          <w:rFonts w:ascii="Arial" w:hAnsi="Arial" w:cs="Arial"/>
-          <w:sz w:val="24"/>
-          <w:szCs w:val="24"/>
-        </w:rPr>
-        <w:t>graficas</w:t>
-      </w:r>
-      <w:proofErr w:type="spellEnd"/>
-      <w:r>
-        <w:rPr>
-          <w:rFonts w:ascii="Arial" w:hAnsi="Arial" w:cs="Arial"/>
-          <w:sz w:val="24"/>
-          <w:szCs w:val="24"/>
-        </w:rPr>
-        <w:t xml:space="preserve"> y tablas que genera la aplicación.</w:t>
+        <w:t>Generará un archivo el cual contendrá un resumen de las graficas y tablas que genera la aplicación.</w:t>
       </w:r>
     </w:p>
     <w:p>
@@ -2758,25 +2639,7 @@
           <w:sz w:val="24"/>
           <w:szCs w:val="24"/>
         </w:rPr>
-        <w:t xml:space="preserve">Método que recibe un Nodo y una lista de tipo </w:t>
-      </w:r>
-      <w:proofErr w:type="spellStart"/>
-      <w:r>
-        <w:rPr>
-          <w:rFonts w:ascii="Arial" w:hAnsi="Arial" w:cs="Arial"/>
-          <w:sz w:val="24"/>
-          <w:szCs w:val="24"/>
-        </w:rPr>
-        <w:t>string</w:t>
-      </w:r>
-      <w:proofErr w:type="spellEnd"/>
-      <w:r>
-        <w:rPr>
-          <w:rFonts w:ascii="Arial" w:hAnsi="Arial" w:cs="Arial"/>
-          <w:sz w:val="24"/>
-          <w:szCs w:val="24"/>
-        </w:rPr>
-        <w:t xml:space="preserve"> de variables, el cual sirve para manipular de una forma más fácil los datos de la gramática de JavaScript, introducir dichos datos en otras litas para luego utilizarlas en los métodos de comparación de clases</w:t>
+        <w:t>Método que recibe un Nodo y una lista de tipo string de variables, el cual sirve para manipular de una forma más fácil los datos de la gramática de JavaScript, introducir dichos datos en otras litas para luego utilizarlas en los métodos de comparación de clases</w:t>
       </w:r>
       <w:r>
         <w:rPr>
@@ -2822,55 +2685,18 @@
           <w:sz w:val="24"/>
           <w:szCs w:val="24"/>
         </w:rPr>
-        <w:t xml:space="preserve">Método que recibe 2 atributos de tipo </w:t>
-      </w:r>
-      <w:proofErr w:type="spellStart"/>
-      <w:r>
-        <w:rPr>
-          <w:rFonts w:ascii="Arial" w:hAnsi="Arial" w:cs="Arial"/>
-          <w:sz w:val="24"/>
-          <w:szCs w:val="24"/>
-        </w:rPr>
-        <w:t>String</w:t>
-      </w:r>
-      <w:proofErr w:type="spellEnd"/>
-      <w:r>
-        <w:rPr>
-          <w:rFonts w:ascii="Arial" w:hAnsi="Arial" w:cs="Arial"/>
-          <w:sz w:val="24"/>
-          <w:szCs w:val="24"/>
-        </w:rPr>
-        <w:t xml:space="preserve"> los cuales son las rutas de los archivos que tenemos que comparar, dicho método funciona solo si 2 archivos se llaman de la misma manera, caso contrario no funcionara, en este método es donde se manipulan los datos mencionados en el método anterior con el fin de saber </w:t>
-      </w:r>
-      <w:proofErr w:type="spellStart"/>
-      <w:r>
-        <w:rPr>
-          <w:rFonts w:ascii="Arial" w:hAnsi="Arial" w:cs="Arial"/>
-          <w:sz w:val="24"/>
-          <w:szCs w:val="24"/>
-        </w:rPr>
-        <w:t>cuales</w:t>
-      </w:r>
-      <w:proofErr w:type="spellEnd"/>
-      <w:r>
-        <w:rPr>
-          <w:rFonts w:ascii="Arial" w:hAnsi="Arial" w:cs="Arial"/>
-          <w:sz w:val="24"/>
-          <w:szCs w:val="24"/>
-        </w:rPr>
-        <w:t xml:space="preserve"> son las variables, clases o comentarios repetidos el cual también maneja una lista para los errores que se encuentren a lo largo de la ejecución de la aplicación.</w:t>
-      </w:r>
-    </w:p>
-    <w:p>
-      <w:pPr>
-        <w:jc w:val="both"/>
-        <w:rPr>
-          <w:rFonts w:ascii="Arial" w:hAnsi="Arial" w:cs="Arial"/>
-          <w:sz w:val="24"/>
-          <w:szCs w:val="24"/>
-        </w:rPr>
-      </w:pPr>
-      <w:proofErr w:type="spellStart"/>
+        <w:t>Método que recibe 2 atributos de tipo String los cuales son las rutas de los archivos que tenemos que comparar, dicho método funciona solo si 2 archivos se llaman de la misma manera, caso contrario no funcionara, en este método es donde se manipulan los datos mencionados en el método anterior con el fin de saber cuales son las variables, clases o comentarios repetidos el cual también maneja una lista para los errores que se encuentren a lo largo de la ejecución de la aplicación.</w:t>
+      </w:r>
+    </w:p>
+    <w:p>
+      <w:pPr>
+        <w:jc w:val="both"/>
+        <w:rPr>
+          <w:rFonts w:ascii="Arial" w:hAnsi="Arial" w:cs="Arial"/>
+          <w:sz w:val="24"/>
+          <w:szCs w:val="24"/>
+        </w:rPr>
+      </w:pPr>
       <w:r>
         <w:rPr>
           <w:rFonts w:ascii="Arial" w:hAnsi="Arial" w:cs="Arial"/>
@@ -2881,7 +2707,6 @@
         </w:rPr>
         <w:t>variables_repetidas</w:t>
       </w:r>
-      <w:proofErr w:type="spellEnd"/>
       <w:r>
         <w:rPr>
           <w:rFonts w:ascii="Arial" w:hAnsi="Arial" w:cs="Arial"/>
@@ -2910,7 +2735,6 @@
           <w:szCs w:val="24"/>
         </w:rPr>
       </w:pPr>
-      <w:proofErr w:type="spellStart"/>
       <w:r>
         <w:rPr>
           <w:rFonts w:ascii="Arial" w:hAnsi="Arial" w:cs="Arial"/>
@@ -2921,7 +2745,6 @@
         </w:rPr>
         <w:t>comentariosrepetidos</w:t>
       </w:r>
-      <w:proofErr w:type="spellEnd"/>
       <w:r>
         <w:rPr>
           <w:rFonts w:ascii="Arial" w:hAnsi="Arial" w:cs="Arial"/>
@@ -2950,7 +2773,6 @@
           <w:szCs w:val="24"/>
         </w:rPr>
       </w:pPr>
-      <w:proofErr w:type="spellStart"/>
       <w:r>
         <w:rPr>
           <w:rFonts w:ascii="Arial" w:hAnsi="Arial" w:cs="Arial"/>
@@ -2991,7 +2813,6 @@
         </w:rPr>
         <w:t>epetidas</w:t>
       </w:r>
-      <w:proofErr w:type="spellEnd"/>
       <w:r>
         <w:rPr>
           <w:rFonts w:ascii="Arial" w:hAnsi="Arial" w:cs="Arial"/>
@@ -3020,7 +2841,6 @@
           <w:szCs w:val="24"/>
         </w:rPr>
       </w:pPr>
-      <w:proofErr w:type="spellStart"/>
       <w:r>
         <w:rPr>
           <w:rFonts w:ascii="Arial" w:hAnsi="Arial" w:cs="Arial"/>
@@ -3051,7 +2871,6 @@
         </w:rPr>
         <w:t>petidos</w:t>
       </w:r>
-      <w:proofErr w:type="spellEnd"/>
       <w:r>
         <w:rPr>
           <w:rFonts w:ascii="Arial" w:hAnsi="Arial" w:cs="Arial"/>
@@ -3070,7 +2889,6 @@
           <w:szCs w:val="24"/>
         </w:rPr>
       </w:pPr>
-      <w:proofErr w:type="spellStart"/>
       <w:r>
         <w:rPr>
           <w:rFonts w:ascii="Arial" w:hAnsi="Arial" w:cs="Arial"/>
@@ -3081,7 +2899,6 @@
         </w:rPr>
         <w:t>ReporteErrores</w:t>
       </w:r>
-      <w:proofErr w:type="spellEnd"/>
       <w:r>
         <w:rPr>
           <w:rFonts w:ascii="Arial" w:hAnsi="Arial" w:cs="Arial"/>
@@ -3110,7 +2927,6 @@
           <w:szCs w:val="24"/>
         </w:rPr>
       </w:pPr>
-      <w:proofErr w:type="spellStart"/>
       <w:r>
         <w:rPr>
           <w:rFonts w:ascii="Arial" w:hAnsi="Arial" w:cs="Arial"/>
@@ -3121,7 +2937,6 @@
         </w:rPr>
         <w:t>ReporteTokens</w:t>
       </w:r>
-      <w:proofErr w:type="spellEnd"/>
       <w:r>
         <w:rPr>
           <w:rFonts w:ascii="Arial" w:hAnsi="Arial" w:cs="Arial"/>
@@ -3150,7 +2965,6 @@
           <w:szCs w:val="24"/>
         </w:rPr>
       </w:pPr>
-      <w:proofErr w:type="spellStart"/>
       <w:r>
         <w:rPr>
           <w:rFonts w:ascii="Arial" w:hAnsi="Arial" w:cs="Arial"/>
@@ -3162,7 +2976,6 @@
         <w:lastRenderedPageBreak/>
         <w:t>generar_graficaBarras</w:t>
       </w:r>
-      <w:proofErr w:type="spellEnd"/>
       <w:r>
         <w:rPr>
           <w:rFonts w:ascii="Arial" w:hAnsi="Arial" w:cs="Arial"/>
@@ -3189,61 +3002,15 @@
         </w:rPr>
         <w:t xml:space="preserve">, además de utilizar las librerías </w:t>
       </w:r>
-      <w:proofErr w:type="spellStart"/>
-      <w:r>
-        <w:rPr>
-          <w:rFonts w:ascii="Arial" w:hAnsi="Arial" w:cs="Arial"/>
-          <w:b/>
-          <w:bCs/>
-          <w:sz w:val="24"/>
-          <w:szCs w:val="24"/>
-        </w:rPr>
-        <w:t>import</w:t>
-      </w:r>
-      <w:proofErr w:type="spellEnd"/>
-      <w:r>
-        <w:rPr>
-          <w:rFonts w:ascii="Arial" w:hAnsi="Arial" w:cs="Arial"/>
-          <w:b/>
-          <w:bCs/>
-          <w:sz w:val="24"/>
-          <w:szCs w:val="24"/>
-        </w:rPr>
-        <w:t xml:space="preserve"> </w:t>
-      </w:r>
-      <w:proofErr w:type="spellStart"/>
-      <w:proofErr w:type="gramStart"/>
-      <w:r>
-        <w:rPr>
-          <w:rFonts w:ascii="Arial" w:hAnsi="Arial" w:cs="Arial"/>
-          <w:b/>
-          <w:bCs/>
-          <w:sz w:val="24"/>
-          <w:szCs w:val="24"/>
-        </w:rPr>
-        <w:t>org.jfree</w:t>
-      </w:r>
-      <w:proofErr w:type="gramEnd"/>
-      <w:r>
-        <w:rPr>
-          <w:rFonts w:ascii="Arial" w:hAnsi="Arial" w:cs="Arial"/>
-          <w:b/>
-          <w:bCs/>
-          <w:sz w:val="24"/>
-          <w:szCs w:val="24"/>
-        </w:rPr>
-        <w:t>.chart.JFreeChart</w:t>
-      </w:r>
-      <w:proofErr w:type="spellEnd"/>
-      <w:r>
-        <w:rPr>
-          <w:rFonts w:ascii="Arial" w:hAnsi="Arial" w:cs="Arial"/>
-          <w:b/>
-          <w:bCs/>
-          <w:sz w:val="24"/>
-          <w:szCs w:val="24"/>
-        </w:rPr>
-        <w:t>;</w:t>
+      <w:r>
+        <w:rPr>
+          <w:rFonts w:ascii="Arial" w:hAnsi="Arial" w:cs="Arial"/>
+          <w:b/>
+          <w:bCs/>
+          <w:sz w:val="24"/>
+          <w:szCs w:val="24"/>
+        </w:rPr>
+        <w:t>import org.jfree.chart.JFreeChart;</w:t>
       </w:r>
       <w:r>
         <w:rPr>
@@ -3255,49 +3022,15 @@
         </w:rPr>
         <w:t xml:space="preserve">, </w:t>
       </w:r>
-      <w:proofErr w:type="spellStart"/>
-      <w:r>
-        <w:rPr>
-          <w:rFonts w:ascii="Arial" w:hAnsi="Arial" w:cs="Arial"/>
-          <w:b/>
-          <w:bCs/>
-          <w:sz w:val="24"/>
-          <w:szCs w:val="24"/>
-        </w:rPr>
-        <w:t>import</w:t>
-      </w:r>
-      <w:proofErr w:type="spellEnd"/>
-      <w:r>
-        <w:rPr>
-          <w:rFonts w:ascii="Arial" w:hAnsi="Arial" w:cs="Arial"/>
-          <w:b/>
-          <w:bCs/>
-          <w:sz w:val="24"/>
-          <w:szCs w:val="24"/>
-        </w:rPr>
-        <w:t xml:space="preserve"> </w:t>
-      </w:r>
-      <w:proofErr w:type="spellStart"/>
-      <w:r>
-        <w:rPr>
-          <w:rFonts w:ascii="Arial" w:hAnsi="Arial" w:cs="Arial"/>
-          <w:b/>
-          <w:bCs/>
-          <w:sz w:val="24"/>
-          <w:szCs w:val="24"/>
-        </w:rPr>
-        <w:t>org.jfree.chart.plot.PlotOrientation</w:t>
-      </w:r>
-      <w:proofErr w:type="spellEnd"/>
-      <w:r>
-        <w:rPr>
-          <w:rFonts w:ascii="Arial" w:hAnsi="Arial" w:cs="Arial"/>
-          <w:b/>
-          <w:bCs/>
-          <w:sz w:val="24"/>
-          <w:szCs w:val="24"/>
-        </w:rPr>
-        <w:t>;</w:t>
+      <w:r>
+        <w:rPr>
+          <w:rFonts w:ascii="Arial" w:hAnsi="Arial" w:cs="Arial"/>
+          <w:b/>
+          <w:bCs/>
+          <w:sz w:val="24"/>
+          <w:szCs w:val="24"/>
+        </w:rPr>
+        <w:t>import org.jfree.chart.plot.PlotOrientation;</w:t>
       </w:r>
       <w:r>
         <w:rPr>
@@ -3309,49 +3042,15 @@
         </w:rPr>
         <w:t xml:space="preserve"> y </w:t>
       </w:r>
-      <w:proofErr w:type="spellStart"/>
-      <w:r>
-        <w:rPr>
-          <w:rFonts w:ascii="Arial" w:hAnsi="Arial" w:cs="Arial"/>
-          <w:b/>
-          <w:bCs/>
-          <w:sz w:val="24"/>
-          <w:szCs w:val="24"/>
-        </w:rPr>
-        <w:t>import</w:t>
-      </w:r>
-      <w:proofErr w:type="spellEnd"/>
-      <w:r>
-        <w:rPr>
-          <w:rFonts w:ascii="Arial" w:hAnsi="Arial" w:cs="Arial"/>
-          <w:b/>
-          <w:bCs/>
-          <w:sz w:val="24"/>
-          <w:szCs w:val="24"/>
-        </w:rPr>
-        <w:t xml:space="preserve"> </w:t>
-      </w:r>
-      <w:proofErr w:type="spellStart"/>
-      <w:r>
-        <w:rPr>
-          <w:rFonts w:ascii="Arial" w:hAnsi="Arial" w:cs="Arial"/>
-          <w:b/>
-          <w:bCs/>
-          <w:sz w:val="24"/>
-          <w:szCs w:val="24"/>
-        </w:rPr>
-        <w:t>org.jfree.data.category.DefaultCategoryDataset</w:t>
-      </w:r>
-      <w:proofErr w:type="spellEnd"/>
-      <w:r>
-        <w:rPr>
-          <w:rFonts w:ascii="Arial" w:hAnsi="Arial" w:cs="Arial"/>
-          <w:b/>
-          <w:bCs/>
-          <w:sz w:val="24"/>
-          <w:szCs w:val="24"/>
-        </w:rPr>
-        <w:t>;</w:t>
+      <w:r>
+        <w:rPr>
+          <w:rFonts w:ascii="Arial" w:hAnsi="Arial" w:cs="Arial"/>
+          <w:b/>
+          <w:bCs/>
+          <w:sz w:val="24"/>
+          <w:szCs w:val="24"/>
+        </w:rPr>
+        <w:t>import org.jfree.data.category.DefaultCategoryDataset;</w:t>
       </w:r>
       <w:r>
         <w:rPr>
@@ -3373,7 +3072,6 @@
           <w:szCs w:val="24"/>
         </w:rPr>
       </w:pPr>
-      <w:proofErr w:type="spellStart"/>
       <w:r>
         <w:rPr>
           <w:rFonts w:ascii="Arial" w:hAnsi="Arial" w:cs="Arial"/>
@@ -3384,7 +3082,6 @@
         </w:rPr>
         <w:t>generar_graficaLineas</w:t>
       </w:r>
-      <w:proofErr w:type="spellEnd"/>
       <w:r>
         <w:rPr>
           <w:rFonts w:ascii="Arial" w:hAnsi="Arial" w:cs="Arial"/>
@@ -3403,7 +3100,92 @@
         </w:rPr>
         <w:t xml:space="preserve">Este método es como el anterior, pero con la ligera diferencia de los atributos a utilizar y la ejecución de una instrucción para generar líneas en lugar de barras el cual es </w:t>
       </w:r>
-      <w:proofErr w:type="spellStart"/>
+      <w:r>
+        <w:rPr>
+          <w:rFonts w:ascii="Arial" w:hAnsi="Arial" w:cs="Arial"/>
+          <w:b/>
+          <w:bCs/>
+          <w:sz w:val="24"/>
+          <w:szCs w:val="24"/>
+        </w:rPr>
+        <w:t>JFreeChart chart = ChartFactory.createXYLineChart();</w:t>
+      </w:r>
+      <w:r>
+        <w:rPr>
+          <w:rFonts w:ascii="Arial" w:hAnsi="Arial" w:cs="Arial"/>
+          <w:b/>
+          <w:bCs/>
+          <w:sz w:val="24"/>
+          <w:szCs w:val="24"/>
+        </w:rPr>
+        <w:t xml:space="preserve">, </w:t>
+      </w:r>
+      <w:r>
+        <w:rPr>
+          <w:rFonts w:ascii="Arial" w:hAnsi="Arial" w:cs="Arial"/>
+          <w:sz w:val="24"/>
+          <w:szCs w:val="24"/>
+        </w:rPr>
+        <w:t xml:space="preserve">el cual recibe dentro de los paréntesis la información de la grafica como lo es: </w:t>
+      </w:r>
+      <w:r>
+        <w:rPr>
+          <w:rFonts w:ascii="Arial" w:hAnsi="Arial" w:cs="Arial"/>
+          <w:b/>
+          <w:bCs/>
+          <w:sz w:val="24"/>
+          <w:szCs w:val="24"/>
+        </w:rPr>
+        <w:t>titulo de la gráfica, nombre del archivo y la puntuación.</w:t>
+      </w:r>
+    </w:p>
+    <w:p>
+      <w:pPr>
+        <w:jc w:val="both"/>
+        <w:rPr>
+          <w:rFonts w:ascii="Arial" w:hAnsi="Arial" w:cs="Arial"/>
+          <w:b/>
+          <w:bCs/>
+          <w:sz w:val="24"/>
+          <w:szCs w:val="24"/>
+        </w:rPr>
+      </w:pPr>
+      <w:r>
+        <w:rPr>
+          <w:rFonts w:ascii="Arial" w:hAnsi="Arial" w:cs="Arial"/>
+          <w:b/>
+          <w:bCs/>
+          <w:sz w:val="24"/>
+          <w:szCs w:val="24"/>
+        </w:rPr>
+        <w:t>generar_graficaPie</w:t>
+      </w:r>
+      <w:r>
+        <w:rPr>
+          <w:rFonts w:ascii="Arial" w:hAnsi="Arial" w:cs="Arial"/>
+          <w:b/>
+          <w:bCs/>
+          <w:sz w:val="24"/>
+          <w:szCs w:val="24"/>
+        </w:rPr>
+        <w:t xml:space="preserve">: </w:t>
+      </w:r>
+      <w:r>
+        <w:rPr>
+          <w:rFonts w:ascii="Arial" w:hAnsi="Arial" w:cs="Arial"/>
+          <w:sz w:val="24"/>
+          <w:szCs w:val="24"/>
+        </w:rPr>
+        <w:t xml:space="preserve">Este método es como los dos anteriores, pero a diferencia de las otras gráficas, esta genera una gráfica de pie, utilizando la </w:t>
+      </w:r>
+      <w:r>
+        <w:rPr>
+          <w:rFonts w:ascii="Arial" w:hAnsi="Arial" w:cs="Arial"/>
+          <w:sz w:val="24"/>
+          <w:szCs w:val="24"/>
+        </w:rPr>
+        <w:t xml:space="preserve">función </w:t>
+      </w:r>
       <w:r>
         <w:rPr>
           <w:rFonts w:ascii="Arial" w:hAnsi="Arial" w:cs="Arial"/>
@@ -3414,234 +3196,25 @@
         </w:rPr>
         <w:t>JFreeChart</w:t>
       </w:r>
-      <w:proofErr w:type="spellEnd"/>
-      <w:r>
-        <w:rPr>
-          <w:rFonts w:ascii="Arial" w:hAnsi="Arial" w:cs="Arial"/>
-          <w:b/>
-          <w:bCs/>
-          <w:sz w:val="24"/>
-          <w:szCs w:val="24"/>
-        </w:rPr>
-        <w:t xml:space="preserve"> chart = </w:t>
-      </w:r>
-      <w:proofErr w:type="spellStart"/>
-      <w:r>
-        <w:rPr>
-          <w:rFonts w:ascii="Arial" w:hAnsi="Arial" w:cs="Arial"/>
-          <w:b/>
-          <w:bCs/>
-          <w:sz w:val="24"/>
-          <w:szCs w:val="24"/>
-        </w:rPr>
-        <w:t>ChartFactory.createXYLineChart</w:t>
-      </w:r>
-      <w:proofErr w:type="spellEnd"/>
-      <w:r>
-        <w:rPr>
-          <w:rFonts w:ascii="Arial" w:hAnsi="Arial" w:cs="Arial"/>
-          <w:b/>
-          <w:bCs/>
-          <w:sz w:val="24"/>
-          <w:szCs w:val="24"/>
-        </w:rPr>
-        <w:t>(</w:t>
-      </w:r>
-      <w:proofErr w:type="gramStart"/>
-      <w:r>
-        <w:rPr>
-          <w:rFonts w:ascii="Arial" w:hAnsi="Arial" w:cs="Arial"/>
-          <w:b/>
-          <w:bCs/>
-          <w:sz w:val="24"/>
-          <w:szCs w:val="24"/>
-        </w:rPr>
-        <w:t>);</w:t>
-      </w:r>
-      <w:r>
-        <w:rPr>
-          <w:rFonts w:ascii="Arial" w:hAnsi="Arial" w:cs="Arial"/>
-          <w:b/>
-          <w:bCs/>
-          <w:sz w:val="24"/>
-          <w:szCs w:val="24"/>
-        </w:rPr>
-        <w:t>,</w:t>
-      </w:r>
-      <w:proofErr w:type="gramEnd"/>
-      <w:r>
-        <w:rPr>
-          <w:rFonts w:ascii="Arial" w:hAnsi="Arial" w:cs="Arial"/>
-          <w:b/>
-          <w:bCs/>
-          <w:sz w:val="24"/>
-          <w:szCs w:val="24"/>
-        </w:rPr>
-        <w:t xml:space="preserve"> </w:t>
-      </w:r>
-      <w:r>
-        <w:rPr>
-          <w:rFonts w:ascii="Arial" w:hAnsi="Arial" w:cs="Arial"/>
-          <w:sz w:val="24"/>
-          <w:szCs w:val="24"/>
-        </w:rPr>
-        <w:t xml:space="preserve">el cual recibe dentro de los paréntesis la información de la </w:t>
-      </w:r>
-      <w:proofErr w:type="spellStart"/>
-      <w:r>
-        <w:rPr>
-          <w:rFonts w:ascii="Arial" w:hAnsi="Arial" w:cs="Arial"/>
-          <w:sz w:val="24"/>
-          <w:szCs w:val="24"/>
-        </w:rPr>
-        <w:t>grafica</w:t>
-      </w:r>
-      <w:proofErr w:type="spellEnd"/>
-      <w:r>
-        <w:rPr>
-          <w:rFonts w:ascii="Arial" w:hAnsi="Arial" w:cs="Arial"/>
-          <w:sz w:val="24"/>
-          <w:szCs w:val="24"/>
-        </w:rPr>
-        <w:t xml:space="preserve"> como lo es: </w:t>
-      </w:r>
-      <w:proofErr w:type="spellStart"/>
-      <w:r>
-        <w:rPr>
-          <w:rFonts w:ascii="Arial" w:hAnsi="Arial" w:cs="Arial"/>
-          <w:b/>
-          <w:bCs/>
-          <w:sz w:val="24"/>
-          <w:szCs w:val="24"/>
-        </w:rPr>
-        <w:t>titulo</w:t>
-      </w:r>
-      <w:proofErr w:type="spellEnd"/>
-      <w:r>
-        <w:rPr>
-          <w:rFonts w:ascii="Arial" w:hAnsi="Arial" w:cs="Arial"/>
-          <w:b/>
-          <w:bCs/>
-          <w:sz w:val="24"/>
-          <w:szCs w:val="24"/>
-        </w:rPr>
-        <w:t xml:space="preserve"> de la gráfica, nombre del archivo y la puntuación.</w:t>
-      </w:r>
-    </w:p>
-    <w:p>
-      <w:pPr>
-        <w:jc w:val="both"/>
-        <w:rPr>
-          <w:rFonts w:ascii="Arial" w:hAnsi="Arial" w:cs="Arial"/>
-          <w:b/>
-          <w:bCs/>
-          <w:sz w:val="24"/>
-          <w:szCs w:val="24"/>
-        </w:rPr>
-      </w:pPr>
-      <w:proofErr w:type="spellStart"/>
-      <w:r>
-        <w:rPr>
-          <w:rFonts w:ascii="Arial" w:hAnsi="Arial" w:cs="Arial"/>
-          <w:b/>
-          <w:bCs/>
-          <w:sz w:val="24"/>
-          <w:szCs w:val="24"/>
-        </w:rPr>
-        <w:t>generar_graficaPie</w:t>
-      </w:r>
-      <w:proofErr w:type="spellEnd"/>
-      <w:r>
-        <w:rPr>
-          <w:rFonts w:ascii="Arial" w:hAnsi="Arial" w:cs="Arial"/>
-          <w:b/>
-          <w:bCs/>
-          <w:sz w:val="24"/>
-          <w:szCs w:val="24"/>
-        </w:rPr>
-        <w:t xml:space="preserve">: </w:t>
-      </w:r>
-      <w:r>
-        <w:rPr>
-          <w:rFonts w:ascii="Arial" w:hAnsi="Arial" w:cs="Arial"/>
-          <w:sz w:val="24"/>
-          <w:szCs w:val="24"/>
-        </w:rPr>
-        <w:t xml:space="preserve">Este método es como los dos anteriores, pero a diferencia de las otras gráficas, esta genera una gráfica de pie, utilizando la </w:t>
-      </w:r>
-      <w:r>
-        <w:rPr>
-          <w:rFonts w:ascii="Arial" w:hAnsi="Arial" w:cs="Arial"/>
-          <w:sz w:val="24"/>
-          <w:szCs w:val="24"/>
-        </w:rPr>
-        <w:t xml:space="preserve">función </w:t>
-      </w:r>
-      <w:proofErr w:type="spellStart"/>
-      <w:r>
-        <w:rPr>
-          <w:rFonts w:ascii="Arial" w:hAnsi="Arial" w:cs="Arial"/>
-          <w:b/>
-          <w:bCs/>
-          <w:sz w:val="24"/>
-          <w:szCs w:val="24"/>
-        </w:rPr>
-        <w:t>JFreeChart</w:t>
-      </w:r>
-      <w:proofErr w:type="spellEnd"/>
-      <w:r>
-        <w:rPr>
-          <w:rFonts w:ascii="Arial" w:hAnsi="Arial" w:cs="Arial"/>
-          <w:b/>
-          <w:bCs/>
-          <w:sz w:val="24"/>
-          <w:szCs w:val="24"/>
-        </w:rPr>
-        <w:t xml:space="preserve"> grafico= </w:t>
-      </w:r>
-      <w:proofErr w:type="spellStart"/>
-      <w:r>
-        <w:rPr>
-          <w:rFonts w:ascii="Arial" w:hAnsi="Arial" w:cs="Arial"/>
-          <w:b/>
-          <w:bCs/>
-          <w:sz w:val="24"/>
-          <w:szCs w:val="24"/>
-        </w:rPr>
-        <w:t>ChartFactory.createPieChart</w:t>
-      </w:r>
-      <w:proofErr w:type="spellEnd"/>
-      <w:r>
-        <w:rPr>
-          <w:rFonts w:ascii="Arial" w:hAnsi="Arial" w:cs="Arial"/>
-          <w:b/>
-          <w:bCs/>
-          <w:sz w:val="24"/>
-          <w:szCs w:val="24"/>
-        </w:rPr>
-        <w:t>(</w:t>
-      </w:r>
-      <w:proofErr w:type="gramStart"/>
-      <w:r>
-        <w:rPr>
-          <w:rFonts w:ascii="Arial" w:hAnsi="Arial" w:cs="Arial"/>
-          <w:b/>
-          <w:bCs/>
-          <w:sz w:val="24"/>
-          <w:szCs w:val="24"/>
-        </w:rPr>
-        <w:t>);,</w:t>
-      </w:r>
-      <w:proofErr w:type="gramEnd"/>
-      <w:r>
-        <w:rPr>
-          <w:rFonts w:ascii="Arial" w:hAnsi="Arial" w:cs="Arial"/>
-          <w:b/>
-          <w:bCs/>
-          <w:sz w:val="24"/>
-          <w:szCs w:val="24"/>
-        </w:rPr>
-        <w:t xml:space="preserve"> </w:t>
+      <w:r>
+        <w:rPr>
+          <w:rFonts w:ascii="Arial" w:hAnsi="Arial" w:cs="Arial"/>
+          <w:b/>
+          <w:bCs/>
+          <w:sz w:val="24"/>
+          <w:szCs w:val="24"/>
+        </w:rPr>
+        <w:t xml:space="preserve"> grafico= ChartFactory.createPieChart</w:t>
+      </w:r>
+      <w:r>
+        <w:rPr>
+          <w:rFonts w:ascii="Arial" w:hAnsi="Arial" w:cs="Arial"/>
+          <w:b/>
+          <w:bCs/>
+          <w:sz w:val="24"/>
+          <w:szCs w:val="24"/>
+        </w:rPr>
+        <w:t xml:space="preserve">();, </w:t>
       </w:r>
       <w:r>
         <w:rPr>
@@ -3651,27 +3224,15 @@
         </w:rPr>
         <w:t xml:space="preserve">el cual recibe dentro de los paréntesis: </w:t>
       </w:r>
-      <w:proofErr w:type="spellStart"/>
-      <w:r>
-        <w:rPr>
-          <w:rFonts w:ascii="Arial" w:hAnsi="Arial" w:cs="Arial"/>
-          <w:b/>
-          <w:bCs/>
-          <w:sz w:val="24"/>
-          <w:szCs w:val="24"/>
-        </w:rPr>
-        <w:t>titulo</w:t>
-      </w:r>
-      <w:proofErr w:type="spellEnd"/>
-      <w:r>
-        <w:rPr>
-          <w:rFonts w:ascii="Arial" w:hAnsi="Arial" w:cs="Arial"/>
-          <w:b/>
-          <w:bCs/>
-          <w:sz w:val="24"/>
-          <w:szCs w:val="24"/>
-        </w:rPr>
-        <w:t xml:space="preserve"> de la gráfica, y los datos necesarios para graficar</w:t>
+      <w:r>
+        <w:rPr>
+          <w:rFonts w:ascii="Arial" w:hAnsi="Arial" w:cs="Arial"/>
+          <w:b/>
+          <w:bCs/>
+          <w:sz w:val="24"/>
+          <w:szCs w:val="24"/>
+        </w:rPr>
+        <w:t>titulo de la gráfica, y los datos necesarios para graficar</w:t>
       </w:r>
     </w:p>
     <w:p>
@@ -3723,7 +3284,6 @@
         </w:rPr>
         <w:t xml:space="preserve">, </w:t>
       </w:r>
-      <w:proofErr w:type="spellStart"/>
       <w:r>
         <w:rPr>
           <w:rFonts w:ascii="Arial" w:hAnsi="Arial" w:cs="Arial"/>
@@ -3754,7 +3314,46 @@
         </w:rPr>
         <w:t>petidos</w:t>
       </w:r>
-      <w:proofErr w:type="spellEnd"/>
+      <w:r>
+        <w:rPr>
+          <w:rFonts w:ascii="Arial" w:hAnsi="Arial" w:cs="Arial"/>
+          <w:b/>
+          <w:bCs/>
+          <w:sz w:val="24"/>
+          <w:szCs w:val="24"/>
+        </w:rPr>
+        <w:t>, C</w:t>
+      </w:r>
+      <w:r>
+        <w:rPr>
+          <w:rFonts w:ascii="Arial" w:hAnsi="Arial" w:cs="Arial"/>
+          <w:b/>
+          <w:bCs/>
+          <w:sz w:val="24"/>
+          <w:szCs w:val="24"/>
+        </w:rPr>
+        <w:t>lases</w:t>
+      </w:r>
+      <w:r>
+        <w:rPr>
+          <w:rFonts w:ascii="Arial" w:hAnsi="Arial" w:cs="Arial"/>
+          <w:b/>
+          <w:bCs/>
+          <w:sz w:val="24"/>
+          <w:szCs w:val="24"/>
+        </w:rPr>
+        <w:t>R</w:t>
+      </w:r>
+      <w:r>
+        <w:rPr>
+          <w:rFonts w:ascii="Arial" w:hAnsi="Arial" w:cs="Arial"/>
+          <w:b/>
+          <w:bCs/>
+          <w:sz w:val="24"/>
+          <w:szCs w:val="24"/>
+        </w:rPr>
+        <w:t>epetidas</w:t>
+      </w:r>
       <w:r>
         <w:rPr>
           <w:rFonts w:ascii="Arial" w:hAnsi="Arial" w:cs="Arial"/>
@@ -3765,59 +3364,6 @@
         </w:rPr>
         <w:t xml:space="preserve">, </w:t>
       </w:r>
-      <w:proofErr w:type="spellStart"/>
-      <w:r>
-        <w:rPr>
-          <w:rFonts w:ascii="Arial" w:hAnsi="Arial" w:cs="Arial"/>
-          <w:b/>
-          <w:bCs/>
-          <w:sz w:val="24"/>
-          <w:szCs w:val="24"/>
-        </w:rPr>
-        <w:t>C</w:t>
-      </w:r>
-      <w:r>
-        <w:rPr>
-          <w:rFonts w:ascii="Arial" w:hAnsi="Arial" w:cs="Arial"/>
-          <w:b/>
-          <w:bCs/>
-          <w:sz w:val="24"/>
-          <w:szCs w:val="24"/>
-        </w:rPr>
-        <w:t>lases</w:t>
-      </w:r>
-      <w:r>
-        <w:rPr>
-          <w:rFonts w:ascii="Arial" w:hAnsi="Arial" w:cs="Arial"/>
-          <w:b/>
-          <w:bCs/>
-          <w:sz w:val="24"/>
-          <w:szCs w:val="24"/>
-        </w:rPr>
-        <w:t>R</w:t>
-      </w:r>
-      <w:r>
-        <w:rPr>
-          <w:rFonts w:ascii="Arial" w:hAnsi="Arial" w:cs="Arial"/>
-          <w:b/>
-          <w:bCs/>
-          <w:sz w:val="24"/>
-          <w:szCs w:val="24"/>
-        </w:rPr>
-        <w:t>epetidas</w:t>
-      </w:r>
-      <w:proofErr w:type="spellEnd"/>
-      <w:r>
-        <w:rPr>
-          <w:rFonts w:ascii="Arial" w:hAnsi="Arial" w:cs="Arial"/>
-          <w:b/>
-          <w:bCs/>
-          <w:sz w:val="24"/>
-          <w:szCs w:val="24"/>
-        </w:rPr>
-        <w:t xml:space="preserve">, </w:t>
-      </w:r>
-      <w:proofErr w:type="spellStart"/>
       <w:r>
         <w:rPr>
           <w:rFonts w:ascii="Arial" w:hAnsi="Arial" w:cs="Arial"/>
@@ -3828,7 +3374,6 @@
         </w:rPr>
         <w:t>comentariosrepetidos</w:t>
       </w:r>
-      <w:proofErr w:type="spellEnd"/>
       <w:r>
         <w:rPr>
           <w:rFonts w:ascii="Arial" w:hAnsi="Arial" w:cs="Arial"/>
@@ -3839,7 +3384,6 @@
         </w:rPr>
         <w:t xml:space="preserve"> y </w:t>
       </w:r>
-      <w:proofErr w:type="spellStart"/>
       <w:r>
         <w:rPr>
           <w:rFonts w:ascii="Arial" w:hAnsi="Arial" w:cs="Arial"/>
@@ -3850,7 +3394,6 @@
         </w:rPr>
         <w:t>variables_repetidas</w:t>
       </w:r>
-      <w:proofErr w:type="spellEnd"/>
     </w:p>
     <w:sectPr>
       <w:pgSz w:w="11906" w:h="16838"/>

</xml_diff>